<commit_message>
Classical Ciphers Blog Completed
</commit_message>
<xml_diff>
--- a/Portfolio/COMP6841_Week_2_z5425064.docx
+++ b/Portfolio/COMP6841_Week_2_z5425064.docx
@@ -231,28 +231,16 @@
               <w:pStyle w:val="ListParagraph"/>
               <w:numPr>
                 <w:ilvl w:val="0"/>
-                <w:numId w:val="4"/>
+                <w:numId w:val="6"/>
               </w:numPr>
+              <w:rPr>
+                <w:kern w:val="2"/>
+                <w:lang w:val="en-AU" w:eastAsia="en-AU"/>
+                <w14:ligatures w14:val="standardContextual"/>
+              </w:rPr>
             </w:pPr>
             <w:r>
-              <w:t xml:space="preserve">From the </w:t>
-            </w:r>
-            <w:r>
-              <w:t>current cipher problems</w:t>
-            </w:r>
-            <w:r>
-              <w:t xml:space="preserve"> I </w:t>
-            </w:r>
-            <w:r>
-              <w:t xml:space="preserve">have tried finding a common starting word of a sentence, as there is a highly likelihood that a sentence will be structure to introduce a context/noun and then a property about it. Words like the, that, is, it </w:t>
-            </w:r>
-            <w:proofErr w:type="spellStart"/>
-            <w:r>
-              <w:t>etc</w:t>
-            </w:r>
-            <w:proofErr w:type="spellEnd"/>
-            <w:r>
-              <w:t xml:space="preserve"> are common targets</w:t>
+              <w:t>I began by looking for common patterns in English sentences.</w:t>
             </w:r>
           </w:p>
           <w:p>
@@ -260,14 +248,51 @@
               <w:pStyle w:val="ListParagraph"/>
               <w:numPr>
                 <w:ilvl w:val="0"/>
-                <w:numId w:val="4"/>
+                <w:numId w:val="6"/>
               </w:numPr>
             </w:pPr>
             <w:r>
-              <w:t>Conjunctions are a high frequency are my target and make the rest of the cipher easier, This reconveys that the more the key or cipher is shared that the more likely that it will be leaked or broken (even ignoring the human element)</w:t>
-            </w:r>
-            <w:r>
-              <w:t>. The more it is present in the sentence the more have more conditions and can narrow down available letters due to English spelling</w:t>
+              <w:t xml:space="preserve">Words like </w:t>
+            </w:r>
+            <w:r>
+              <w:rPr>
+                <w:i/>
+                <w:iCs/>
+              </w:rPr>
+              <w:t>the</w:t>
+            </w:r>
+            <w:r>
+              <w:t xml:space="preserve">, </w:t>
+            </w:r>
+            <w:r>
+              <w:rPr>
+                <w:i/>
+                <w:iCs/>
+              </w:rPr>
+              <w:t>that</w:t>
+            </w:r>
+            <w:r>
+              <w:t xml:space="preserve">, </w:t>
+            </w:r>
+            <w:r>
+              <w:rPr>
+                <w:i/>
+                <w:iCs/>
+              </w:rPr>
+              <w:t>is</w:t>
+            </w:r>
+            <w:r>
+              <w:t xml:space="preserve">, and </w:t>
+            </w:r>
+            <w:r>
+              <w:rPr>
+                <w:i/>
+                <w:iCs/>
+              </w:rPr>
+              <w:t>it</w:t>
+            </w:r>
+            <w:r>
+              <w:t xml:space="preserve"> helped because they appear often and made parts of the cipher easier to guess.</w:t>
             </w:r>
           </w:p>
           <w:p>
@@ -275,12 +300,82 @@
               <w:pStyle w:val="ListParagraph"/>
               <w:numPr>
                 <w:ilvl w:val="0"/>
-                <w:numId w:val="4"/>
+                <w:numId w:val="6"/>
               </w:numPr>
             </w:pPr>
+            <w:r>
+              <w:t xml:space="preserve">Short words such as </w:t>
+            </w:r>
+            <w:r>
+              <w:rPr>
+                <w:i/>
+                <w:iCs/>
+              </w:rPr>
+              <w:t>to</w:t>
+            </w:r>
+            <w:r>
+              <w:t xml:space="preserve">, </w:t>
+            </w:r>
+            <w:r>
+              <w:rPr>
+                <w:i/>
+                <w:iCs/>
+              </w:rPr>
+              <w:t>or</w:t>
+            </w:r>
+            <w:r>
+              <w:t xml:space="preserve">, </w:t>
+            </w:r>
+            <w:r>
+              <w:rPr>
+                <w:i/>
+                <w:iCs/>
+              </w:rPr>
+              <w:t>is</w:t>
+            </w:r>
+            <w:r>
+              <w:t xml:space="preserve">, and </w:t>
+            </w:r>
+            <w:r>
+              <w:rPr>
+                <w:i/>
+                <w:iCs/>
+              </w:rPr>
+              <w:t>it</w:t>
+            </w:r>
+            <w:r>
+              <w:t xml:space="preserve"> were useful for working out individual letters.</w:t>
+            </w:r>
           </w:p>
           <w:p>
-            <w:r>
+            <w:pPr>
+              <w:pStyle w:val="ListParagraph"/>
+              <w:numPr>
+                <w:ilvl w:val="0"/>
+                <w:numId w:val="6"/>
+              </w:numPr>
+            </w:pPr>
+            <w:r>
+              <w:t>After identifying a few letters, I used repeated patterns and normal English spelling to narrow down the remaining options.</w:t>
+            </w:r>
+          </w:p>
+          <w:p>
+            <w:pPr>
+              <w:pStyle w:val="ListParagraph"/>
+              <w:numPr>
+                <w:ilvl w:val="0"/>
+                <w:numId w:val="6"/>
+              </w:numPr>
+            </w:pPr>
+            <w:r>
+              <w:t>This showed me that reusing a cipher or key can reveal patterns over time, making it easier to break.</w:t>
+            </w:r>
+          </w:p>
+          <w:p>
+            <w:r>
+              <w:rPr>
+                <w:noProof/>
+              </w:rPr>
               <w:lastRenderedPageBreak/>
               <w:drawing>
                 <wp:inline distT="0" distB="0" distL="0" distR="0" wp14:anchorId="0022DA65" wp14:editId="4B0EDF7C">
@@ -322,6 +417,9 @@
           <w:p/>
           <w:p>
             <w:r>
+              <w:rPr>
+                <w:noProof/>
+              </w:rPr>
               <w:drawing>
                 <wp:inline distT="0" distB="0" distL="0" distR="0" wp14:anchorId="09B5EE59" wp14:editId="23858295">
                   <wp:extent cx="5943600" cy="1883410"/>
@@ -412,17 +510,43 @@
           <w:tcPr>
             <w:tcW w:w="9360" w:type="dxa"/>
           </w:tcPr>
-          <w:p/>
-          <w:p/>
-          <w:p/>
           <w:p>
             <w:r>
+              <w:t>Cipher: Playfair Cipher</w:t>
+            </w:r>
+          </w:p>
+          <w:p>
+            <w:r>
+              <w:t>Key: PSITHURISM</w:t>
+            </w:r>
+          </w:p>
+          <w:p>
+            <w:r>
+              <w:t>Encrypted: RKSAUFMDSTFRMSMO</w:t>
+            </w:r>
+          </w:p>
+          <w:p>
+            <w:r>
+              <w:t xml:space="preserve">The most interesting part of the Playfair Cipher was how much it relies on the secrecy of the key grid. Once an attacker can make good guesses about parts of the message, the </w:t>
+            </w:r>
+            <w:r>
               <w:lastRenderedPageBreak/>
+              <w:t>grid becomes much easier to reconstruct, which weakens the whole system. This shows how a single point of failure can make an encryption method vulnerable.</w:t>
+            </w:r>
+          </w:p>
+          <w:p/>
+          <w:p>
+            <w:r>
+              <w:t>A major weakness is the human element. Messages often follow predictable formats, such as starting with “Dear [Name],” which can give attackers clues about the plaintext. Playfair was designed to be quick and practical to use, especially for decryption, but that convenience also made it weaker once enough patterns were known. In terms of type 1 and type 2 errors, the cipher reduces the chance of legitimate users failing to decrypt messages quickly, but it increases the risk that an attacker can break the message once they understand the grid.</w:t>
+            </w:r>
+          </w:p>
+          <w:p>
+            <w:r>
               <w:drawing>
-                <wp:inline distT="0" distB="0" distL="0" distR="0" wp14:anchorId="2A1311EB" wp14:editId="38A340C2">
-                  <wp:extent cx="5943600" cy="1617980"/>
-                  <wp:effectExtent l="0" t="0" r="0" b="1270"/>
-                  <wp:docPr id="952140227" name="Picture 1"/>
+                <wp:inline distT="0" distB="0" distL="0" distR="0" wp14:anchorId="6DE2F0A1" wp14:editId="36363199">
+                  <wp:extent cx="5943600" cy="4239895"/>
+                  <wp:effectExtent l="0" t="0" r="0" b="8255"/>
+                  <wp:docPr id="650007601" name="Picture 1"/>
                   <wp:cNvGraphicFramePr>
                     <a:graphicFrameLocks xmlns:a="http://schemas.openxmlformats.org/drawingml/2006/main" noChangeAspect="1"/>
                   </wp:cNvGraphicFramePr>
@@ -430,7 +554,7 @@
                     <a:graphicData uri="http://schemas.openxmlformats.org/drawingml/2006/picture">
                       <pic:pic xmlns:pic="http://schemas.openxmlformats.org/drawingml/2006/picture">
                         <pic:nvPicPr>
-                          <pic:cNvPr id="952140227" name=""/>
+                          <pic:cNvPr id="650007601" name=""/>
                           <pic:cNvPicPr/>
                         </pic:nvPicPr>
                         <pic:blipFill>
@@ -442,7 +566,7 @@
                         <pic:spPr>
                           <a:xfrm>
                             <a:off x="0" y="0"/>
-                            <a:ext cx="5943600" cy="1617980"/>
+                            <a:ext cx="5943600" cy="4239895"/>
                           </a:xfrm>
                           <a:prstGeom prst="rect">
                             <a:avLst/>
@@ -454,6 +578,15 @@
                 </wp:inline>
               </w:drawing>
             </w:r>
+          </w:p>
+          <w:p>
+            <w:r>
+              <w:t>Decrypted Word: Ultracrepidarian</w:t>
+            </w:r>
+          </w:p>
+          <w:p/>
+          <w:p/>
+          <w:p>
             <w:r>
               <w:t xml:space="preserve"> </w:t>
             </w:r>
@@ -905,6 +1038,304 @@
 <file path=word/numbering.xml><?xml version="1.0" encoding="utf-8"?>
 <w:numbering xmlns:wpc="http://schemas.microsoft.com/office/word/2010/wordprocessingCanvas" xmlns:cx="http://schemas.microsoft.com/office/drawing/2014/chartex" xmlns:cx1="http://schemas.microsoft.com/office/drawing/2015/9/8/chartex" xmlns:cx2="http://schemas.microsoft.com/office/drawing/2015/10/21/chartex" xmlns:cx3="http://schemas.microsoft.com/office/drawing/2016/5/9/chartex" xmlns:cx4="http://schemas.microsoft.com/office/drawing/2016/5/10/chartex" xmlns:cx5="http://schemas.microsoft.com/office/drawing/2016/5/11/chartex" xmlns:cx6="http://schemas.microsoft.com/office/drawing/2016/5/12/chartex" xmlns:cx7="http://schemas.microsoft.com/office/drawing/2016/5/13/chartex" xmlns:cx8="http://schemas.microsoft.com/office/drawing/2016/5/14/chartex" xmlns:mc="http://schemas.openxmlformats.org/markup-compatibility/2006" xmlns:aink="http://schemas.microsoft.com/office/drawing/2016/ink" xmlns:am3d="http://schemas.microsoft.com/office/drawing/2017/model3d" xmlns:o="urn:schemas-microsoft-com:office:office" xmlns:oel="http://schemas.microsoft.com/office/2019/extlst" xmlns:r="http://schemas.openxmlformats.org/officeDocument/2006/relationships" xmlns:m="http://schemas.openxmlformats.org/officeDocument/2006/math" xmlns:v="urn:schemas-microsoft-com:vml" xmlns:wp14="http://schemas.microsoft.com/office/word/2010/wordprocessingDrawing" xmlns:wp="http://schemas.openxmlformats.org/drawingml/2006/wordprocessingDrawing" xmlns:w10="urn:schemas-microsoft-com:office:word" xmlns:w="http://schemas.openxmlformats.org/wordprocessingml/2006/main" xmlns:w14="http://schemas.microsoft.com/office/word/2010/wordml" xmlns:w15="http://schemas.microsoft.com/office/word/2012/wordml" xmlns:w16cex="http://schemas.microsoft.com/office/word/2018/wordml/cex" xmlns:w16cid="http://schemas.microsoft.com/office/word/2016/wordml/cid" xmlns:w16="http://schemas.microsoft.com/office/word/2018/wordml" xmlns:w16du="http://schemas.microsoft.com/office/word/2023/wordml/word16du" xmlns:w16sdtdh="http://schemas.microsoft.com/office/word/2020/wordml/sdtdatahash" xmlns:w16sdtfl="http://schemas.microsoft.com/office/word/2024/wordml/sdtformatlock" xmlns:w16se="http://schemas.microsoft.com/office/word/2015/wordml/symex" xmlns:wpg="http://schemas.microsoft.com/office/word/2010/wordprocessingGroup" xmlns:wpi="http://schemas.microsoft.com/office/word/2010/wordprocessingInk" xmlns:wne="http://schemas.microsoft.com/office/word/2006/wordml" xmlns:wps="http://schemas.microsoft.com/office/word/2010/wordprocessingShape" mc:Ignorable="w14 w15 w16se w16cid w16 w16cex w16sdtdh w16sdtfl w16du wp14">
   <w:abstractNum w:abstractNumId="0" w15:restartNumberingAfterBreak="0">
+    <w:nsid w:val="02924863"/>
+    <w:multiLevelType w:val="multilevel"/>
+    <w:tmpl w:val="73D660F6"/>
+    <w:lvl w:ilvl="0">
+      <w:start w:val="1"/>
+      <w:numFmt w:val="bullet"/>
+      <w:lvlText w:val=""/>
+      <w:lvlJc w:val="left"/>
+      <w:pPr>
+        <w:tabs>
+          <w:tab w:val="num" w:pos="720"/>
+        </w:tabs>
+        <w:ind w:left="720" w:hanging="360"/>
+      </w:pPr>
+      <w:rPr>
+        <w:rFonts w:ascii="Symbol" w:hAnsi="Symbol" w:hint="default"/>
+        <w:sz w:val="20"/>
+      </w:rPr>
+    </w:lvl>
+    <w:lvl w:ilvl="1" w:tentative="1">
+      <w:start w:val="1"/>
+      <w:numFmt w:val="bullet"/>
+      <w:lvlText w:val="o"/>
+      <w:lvlJc w:val="left"/>
+      <w:pPr>
+        <w:tabs>
+          <w:tab w:val="num" w:pos="1440"/>
+        </w:tabs>
+        <w:ind w:left="1440" w:hanging="360"/>
+      </w:pPr>
+      <w:rPr>
+        <w:rFonts w:ascii="Courier New" w:hAnsi="Courier New" w:hint="default"/>
+        <w:sz w:val="20"/>
+      </w:rPr>
+    </w:lvl>
+    <w:lvl w:ilvl="2" w:tentative="1">
+      <w:start w:val="1"/>
+      <w:numFmt w:val="bullet"/>
+      <w:lvlText w:val=""/>
+      <w:lvlJc w:val="left"/>
+      <w:pPr>
+        <w:tabs>
+          <w:tab w:val="num" w:pos="2160"/>
+        </w:tabs>
+        <w:ind w:left="2160" w:hanging="360"/>
+      </w:pPr>
+      <w:rPr>
+        <w:rFonts w:ascii="Wingdings" w:hAnsi="Wingdings" w:hint="default"/>
+        <w:sz w:val="20"/>
+      </w:rPr>
+    </w:lvl>
+    <w:lvl w:ilvl="3" w:tentative="1">
+      <w:start w:val="1"/>
+      <w:numFmt w:val="bullet"/>
+      <w:lvlText w:val=""/>
+      <w:lvlJc w:val="left"/>
+      <w:pPr>
+        <w:tabs>
+          <w:tab w:val="num" w:pos="2880"/>
+        </w:tabs>
+        <w:ind w:left="2880" w:hanging="360"/>
+      </w:pPr>
+      <w:rPr>
+        <w:rFonts w:ascii="Wingdings" w:hAnsi="Wingdings" w:hint="default"/>
+        <w:sz w:val="20"/>
+      </w:rPr>
+    </w:lvl>
+    <w:lvl w:ilvl="4" w:tentative="1">
+      <w:start w:val="1"/>
+      <w:numFmt w:val="bullet"/>
+      <w:lvlText w:val=""/>
+      <w:lvlJc w:val="left"/>
+      <w:pPr>
+        <w:tabs>
+          <w:tab w:val="num" w:pos="3600"/>
+        </w:tabs>
+        <w:ind w:left="3600" w:hanging="360"/>
+      </w:pPr>
+      <w:rPr>
+        <w:rFonts w:ascii="Wingdings" w:hAnsi="Wingdings" w:hint="default"/>
+        <w:sz w:val="20"/>
+      </w:rPr>
+    </w:lvl>
+    <w:lvl w:ilvl="5" w:tentative="1">
+      <w:start w:val="1"/>
+      <w:numFmt w:val="bullet"/>
+      <w:lvlText w:val=""/>
+      <w:lvlJc w:val="left"/>
+      <w:pPr>
+        <w:tabs>
+          <w:tab w:val="num" w:pos="4320"/>
+        </w:tabs>
+        <w:ind w:left="4320" w:hanging="360"/>
+      </w:pPr>
+      <w:rPr>
+        <w:rFonts w:ascii="Wingdings" w:hAnsi="Wingdings" w:hint="default"/>
+        <w:sz w:val="20"/>
+      </w:rPr>
+    </w:lvl>
+    <w:lvl w:ilvl="6" w:tentative="1">
+      <w:start w:val="1"/>
+      <w:numFmt w:val="bullet"/>
+      <w:lvlText w:val=""/>
+      <w:lvlJc w:val="left"/>
+      <w:pPr>
+        <w:tabs>
+          <w:tab w:val="num" w:pos="5040"/>
+        </w:tabs>
+        <w:ind w:left="5040" w:hanging="360"/>
+      </w:pPr>
+      <w:rPr>
+        <w:rFonts w:ascii="Wingdings" w:hAnsi="Wingdings" w:hint="default"/>
+        <w:sz w:val="20"/>
+      </w:rPr>
+    </w:lvl>
+    <w:lvl w:ilvl="7" w:tentative="1">
+      <w:start w:val="1"/>
+      <w:numFmt w:val="bullet"/>
+      <w:lvlText w:val=""/>
+      <w:lvlJc w:val="left"/>
+      <w:pPr>
+        <w:tabs>
+          <w:tab w:val="num" w:pos="5760"/>
+        </w:tabs>
+        <w:ind w:left="5760" w:hanging="360"/>
+      </w:pPr>
+      <w:rPr>
+        <w:rFonts w:ascii="Wingdings" w:hAnsi="Wingdings" w:hint="default"/>
+        <w:sz w:val="20"/>
+      </w:rPr>
+    </w:lvl>
+    <w:lvl w:ilvl="8" w:tentative="1">
+      <w:start w:val="1"/>
+      <w:numFmt w:val="bullet"/>
+      <w:lvlText w:val=""/>
+      <w:lvlJc w:val="left"/>
+      <w:pPr>
+        <w:tabs>
+          <w:tab w:val="num" w:pos="6480"/>
+        </w:tabs>
+        <w:ind w:left="6480" w:hanging="360"/>
+      </w:pPr>
+      <w:rPr>
+        <w:rFonts w:ascii="Wingdings" w:hAnsi="Wingdings" w:hint="default"/>
+        <w:sz w:val="20"/>
+      </w:rPr>
+    </w:lvl>
+  </w:abstractNum>
+  <w:abstractNum w:abstractNumId="1" w15:restartNumberingAfterBreak="0">
+    <w:nsid w:val="0FE73F10"/>
+    <w:multiLevelType w:val="multilevel"/>
+    <w:tmpl w:val="025616CC"/>
+    <w:lvl w:ilvl="0">
+      <w:start w:val="1"/>
+      <w:numFmt w:val="bullet"/>
+      <w:lvlText w:val=""/>
+      <w:lvlJc w:val="left"/>
+      <w:pPr>
+        <w:tabs>
+          <w:tab w:val="num" w:pos="720"/>
+        </w:tabs>
+        <w:ind w:left="720" w:hanging="360"/>
+      </w:pPr>
+      <w:rPr>
+        <w:rFonts w:ascii="Symbol" w:hAnsi="Symbol" w:hint="default"/>
+        <w:sz w:val="20"/>
+      </w:rPr>
+    </w:lvl>
+    <w:lvl w:ilvl="1" w:tentative="1">
+      <w:start w:val="1"/>
+      <w:numFmt w:val="bullet"/>
+      <w:lvlText w:val="o"/>
+      <w:lvlJc w:val="left"/>
+      <w:pPr>
+        <w:tabs>
+          <w:tab w:val="num" w:pos="1440"/>
+        </w:tabs>
+        <w:ind w:left="1440" w:hanging="360"/>
+      </w:pPr>
+      <w:rPr>
+        <w:rFonts w:ascii="Courier New" w:hAnsi="Courier New" w:hint="default"/>
+        <w:sz w:val="20"/>
+      </w:rPr>
+    </w:lvl>
+    <w:lvl w:ilvl="2" w:tentative="1">
+      <w:start w:val="1"/>
+      <w:numFmt w:val="bullet"/>
+      <w:lvlText w:val=""/>
+      <w:lvlJc w:val="left"/>
+      <w:pPr>
+        <w:tabs>
+          <w:tab w:val="num" w:pos="2160"/>
+        </w:tabs>
+        <w:ind w:left="2160" w:hanging="360"/>
+      </w:pPr>
+      <w:rPr>
+        <w:rFonts w:ascii="Wingdings" w:hAnsi="Wingdings" w:hint="default"/>
+        <w:sz w:val="20"/>
+      </w:rPr>
+    </w:lvl>
+    <w:lvl w:ilvl="3" w:tentative="1">
+      <w:start w:val="1"/>
+      <w:numFmt w:val="bullet"/>
+      <w:lvlText w:val=""/>
+      <w:lvlJc w:val="left"/>
+      <w:pPr>
+        <w:tabs>
+          <w:tab w:val="num" w:pos="2880"/>
+        </w:tabs>
+        <w:ind w:left="2880" w:hanging="360"/>
+      </w:pPr>
+      <w:rPr>
+        <w:rFonts w:ascii="Wingdings" w:hAnsi="Wingdings" w:hint="default"/>
+        <w:sz w:val="20"/>
+      </w:rPr>
+    </w:lvl>
+    <w:lvl w:ilvl="4" w:tentative="1">
+      <w:start w:val="1"/>
+      <w:numFmt w:val="bullet"/>
+      <w:lvlText w:val=""/>
+      <w:lvlJc w:val="left"/>
+      <w:pPr>
+        <w:tabs>
+          <w:tab w:val="num" w:pos="3600"/>
+        </w:tabs>
+        <w:ind w:left="3600" w:hanging="360"/>
+      </w:pPr>
+      <w:rPr>
+        <w:rFonts w:ascii="Wingdings" w:hAnsi="Wingdings" w:hint="default"/>
+        <w:sz w:val="20"/>
+      </w:rPr>
+    </w:lvl>
+    <w:lvl w:ilvl="5" w:tentative="1">
+      <w:start w:val="1"/>
+      <w:numFmt w:val="bullet"/>
+      <w:lvlText w:val=""/>
+      <w:lvlJc w:val="left"/>
+      <w:pPr>
+        <w:tabs>
+          <w:tab w:val="num" w:pos="4320"/>
+        </w:tabs>
+        <w:ind w:left="4320" w:hanging="360"/>
+      </w:pPr>
+      <w:rPr>
+        <w:rFonts w:ascii="Wingdings" w:hAnsi="Wingdings" w:hint="default"/>
+        <w:sz w:val="20"/>
+      </w:rPr>
+    </w:lvl>
+    <w:lvl w:ilvl="6" w:tentative="1">
+      <w:start w:val="1"/>
+      <w:numFmt w:val="bullet"/>
+      <w:lvlText w:val=""/>
+      <w:lvlJc w:val="left"/>
+      <w:pPr>
+        <w:tabs>
+          <w:tab w:val="num" w:pos="5040"/>
+        </w:tabs>
+        <w:ind w:left="5040" w:hanging="360"/>
+      </w:pPr>
+      <w:rPr>
+        <w:rFonts w:ascii="Wingdings" w:hAnsi="Wingdings" w:hint="default"/>
+        <w:sz w:val="20"/>
+      </w:rPr>
+    </w:lvl>
+    <w:lvl w:ilvl="7" w:tentative="1">
+      <w:start w:val="1"/>
+      <w:numFmt w:val="bullet"/>
+      <w:lvlText w:val=""/>
+      <w:lvlJc w:val="left"/>
+      <w:pPr>
+        <w:tabs>
+          <w:tab w:val="num" w:pos="5760"/>
+        </w:tabs>
+        <w:ind w:left="5760" w:hanging="360"/>
+      </w:pPr>
+      <w:rPr>
+        <w:rFonts w:ascii="Wingdings" w:hAnsi="Wingdings" w:hint="default"/>
+        <w:sz w:val="20"/>
+      </w:rPr>
+    </w:lvl>
+    <w:lvl w:ilvl="8" w:tentative="1">
+      <w:start w:val="1"/>
+      <w:numFmt w:val="bullet"/>
+      <w:lvlText w:val=""/>
+      <w:lvlJc w:val="left"/>
+      <w:pPr>
+        <w:tabs>
+          <w:tab w:val="num" w:pos="6480"/>
+        </w:tabs>
+        <w:ind w:left="6480" w:hanging="360"/>
+      </w:pPr>
+      <w:rPr>
+        <w:rFonts w:ascii="Wingdings" w:hAnsi="Wingdings" w:hint="default"/>
+        <w:sz w:val="20"/>
+      </w:rPr>
+    </w:lvl>
+  </w:abstractNum>
+  <w:abstractNum w:abstractNumId="2" w15:restartNumberingAfterBreak="0">
     <w:nsid w:val="15132DEC"/>
     <w:multiLevelType w:val="hybridMultilevel"/>
     <w:tmpl w:val="4E021DBA"/>
@@ -1016,7 +1447,7 @@
       </w:rPr>
     </w:lvl>
   </w:abstractNum>
-  <w:abstractNum w:abstractNumId="1" w15:restartNumberingAfterBreak="0">
+  <w:abstractNum w:abstractNumId="3" w15:restartNumberingAfterBreak="0">
     <w:nsid w:val="4923DB14"/>
     <w:multiLevelType w:val="hybridMultilevel"/>
     <w:tmpl w:val="2AA69DEE"/>
@@ -1102,7 +1533,156 @@
       </w:pPr>
     </w:lvl>
   </w:abstractNum>
-  <w:abstractNum w:abstractNumId="2" w15:restartNumberingAfterBreak="0">
+  <w:abstractNum w:abstractNumId="4" w15:restartNumberingAfterBreak="0">
+    <w:nsid w:val="4C900651"/>
+    <w:multiLevelType w:val="multilevel"/>
+    <w:tmpl w:val="1820E766"/>
+    <w:lvl w:ilvl="0">
+      <w:start w:val="1"/>
+      <w:numFmt w:val="bullet"/>
+      <w:lvlText w:val=""/>
+      <w:lvlJc w:val="left"/>
+      <w:pPr>
+        <w:tabs>
+          <w:tab w:val="num" w:pos="720"/>
+        </w:tabs>
+        <w:ind w:left="720" w:hanging="360"/>
+      </w:pPr>
+      <w:rPr>
+        <w:rFonts w:ascii="Symbol" w:hAnsi="Symbol" w:hint="default"/>
+        <w:sz w:val="20"/>
+      </w:rPr>
+    </w:lvl>
+    <w:lvl w:ilvl="1" w:tentative="1">
+      <w:start w:val="1"/>
+      <w:numFmt w:val="bullet"/>
+      <w:lvlText w:val="o"/>
+      <w:lvlJc w:val="left"/>
+      <w:pPr>
+        <w:tabs>
+          <w:tab w:val="num" w:pos="1440"/>
+        </w:tabs>
+        <w:ind w:left="1440" w:hanging="360"/>
+      </w:pPr>
+      <w:rPr>
+        <w:rFonts w:ascii="Courier New" w:hAnsi="Courier New" w:hint="default"/>
+        <w:sz w:val="20"/>
+      </w:rPr>
+    </w:lvl>
+    <w:lvl w:ilvl="2" w:tentative="1">
+      <w:start w:val="1"/>
+      <w:numFmt w:val="bullet"/>
+      <w:lvlText w:val=""/>
+      <w:lvlJc w:val="left"/>
+      <w:pPr>
+        <w:tabs>
+          <w:tab w:val="num" w:pos="2160"/>
+        </w:tabs>
+        <w:ind w:left="2160" w:hanging="360"/>
+      </w:pPr>
+      <w:rPr>
+        <w:rFonts w:ascii="Wingdings" w:hAnsi="Wingdings" w:hint="default"/>
+        <w:sz w:val="20"/>
+      </w:rPr>
+    </w:lvl>
+    <w:lvl w:ilvl="3" w:tentative="1">
+      <w:start w:val="1"/>
+      <w:numFmt w:val="bullet"/>
+      <w:lvlText w:val=""/>
+      <w:lvlJc w:val="left"/>
+      <w:pPr>
+        <w:tabs>
+          <w:tab w:val="num" w:pos="2880"/>
+        </w:tabs>
+        <w:ind w:left="2880" w:hanging="360"/>
+      </w:pPr>
+      <w:rPr>
+        <w:rFonts w:ascii="Wingdings" w:hAnsi="Wingdings" w:hint="default"/>
+        <w:sz w:val="20"/>
+      </w:rPr>
+    </w:lvl>
+    <w:lvl w:ilvl="4" w:tentative="1">
+      <w:start w:val="1"/>
+      <w:numFmt w:val="bullet"/>
+      <w:lvlText w:val=""/>
+      <w:lvlJc w:val="left"/>
+      <w:pPr>
+        <w:tabs>
+          <w:tab w:val="num" w:pos="3600"/>
+        </w:tabs>
+        <w:ind w:left="3600" w:hanging="360"/>
+      </w:pPr>
+      <w:rPr>
+        <w:rFonts w:ascii="Wingdings" w:hAnsi="Wingdings" w:hint="default"/>
+        <w:sz w:val="20"/>
+      </w:rPr>
+    </w:lvl>
+    <w:lvl w:ilvl="5" w:tentative="1">
+      <w:start w:val="1"/>
+      <w:numFmt w:val="bullet"/>
+      <w:lvlText w:val=""/>
+      <w:lvlJc w:val="left"/>
+      <w:pPr>
+        <w:tabs>
+          <w:tab w:val="num" w:pos="4320"/>
+        </w:tabs>
+        <w:ind w:left="4320" w:hanging="360"/>
+      </w:pPr>
+      <w:rPr>
+        <w:rFonts w:ascii="Wingdings" w:hAnsi="Wingdings" w:hint="default"/>
+        <w:sz w:val="20"/>
+      </w:rPr>
+    </w:lvl>
+    <w:lvl w:ilvl="6" w:tentative="1">
+      <w:start w:val="1"/>
+      <w:numFmt w:val="bullet"/>
+      <w:lvlText w:val=""/>
+      <w:lvlJc w:val="left"/>
+      <w:pPr>
+        <w:tabs>
+          <w:tab w:val="num" w:pos="5040"/>
+        </w:tabs>
+        <w:ind w:left="5040" w:hanging="360"/>
+      </w:pPr>
+      <w:rPr>
+        <w:rFonts w:ascii="Wingdings" w:hAnsi="Wingdings" w:hint="default"/>
+        <w:sz w:val="20"/>
+      </w:rPr>
+    </w:lvl>
+    <w:lvl w:ilvl="7" w:tentative="1">
+      <w:start w:val="1"/>
+      <w:numFmt w:val="bullet"/>
+      <w:lvlText w:val=""/>
+      <w:lvlJc w:val="left"/>
+      <w:pPr>
+        <w:tabs>
+          <w:tab w:val="num" w:pos="5760"/>
+        </w:tabs>
+        <w:ind w:left="5760" w:hanging="360"/>
+      </w:pPr>
+      <w:rPr>
+        <w:rFonts w:ascii="Wingdings" w:hAnsi="Wingdings" w:hint="default"/>
+        <w:sz w:val="20"/>
+      </w:rPr>
+    </w:lvl>
+    <w:lvl w:ilvl="8" w:tentative="1">
+      <w:start w:val="1"/>
+      <w:numFmt w:val="bullet"/>
+      <w:lvlText w:val=""/>
+      <w:lvlJc w:val="left"/>
+      <w:pPr>
+        <w:tabs>
+          <w:tab w:val="num" w:pos="6480"/>
+        </w:tabs>
+        <w:ind w:left="6480" w:hanging="360"/>
+      </w:pPr>
+      <w:rPr>
+        <w:rFonts w:ascii="Wingdings" w:hAnsi="Wingdings" w:hint="default"/>
+        <w:sz w:val="20"/>
+      </w:rPr>
+    </w:lvl>
+  </w:abstractNum>
+  <w:abstractNum w:abstractNumId="5" w15:restartNumberingAfterBreak="0">
     <w:nsid w:val="59204C81"/>
     <w:multiLevelType w:val="hybridMultilevel"/>
     <w:tmpl w:val="00620D24"/>
@@ -1188,7 +1768,7 @@
       </w:pPr>
     </w:lvl>
   </w:abstractNum>
-  <w:abstractNum w:abstractNumId="3" w15:restartNumberingAfterBreak="0">
+  <w:abstractNum w:abstractNumId="6" w15:restartNumberingAfterBreak="0">
     <w:nsid w:val="786060C3"/>
     <w:multiLevelType w:val="hybridMultilevel"/>
     <w:tmpl w:val="45F419B8"/>
@@ -1275,16 +1855,25 @@
     </w:lvl>
   </w:abstractNum>
   <w:num w:numId="1" w16cid:durableId="844052501">
+    <w:abstractNumId w:val="6"/>
+  </w:num>
+  <w:num w:numId="2" w16cid:durableId="226889906">
+    <w:abstractNumId w:val="5"/>
+  </w:num>
+  <w:num w:numId="3" w16cid:durableId="1325090021">
     <w:abstractNumId w:val="3"/>
   </w:num>
-  <w:num w:numId="2" w16cid:durableId="226889906">
+  <w:num w:numId="4" w16cid:durableId="1635788331">
     <w:abstractNumId w:val="2"/>
   </w:num>
-  <w:num w:numId="3" w16cid:durableId="1325090021">
+  <w:num w:numId="5" w16cid:durableId="488137113">
+    <w:abstractNumId w:val="0"/>
+  </w:num>
+  <w:num w:numId="6" w16cid:durableId="1815373947">
+    <w:abstractNumId w:val="4"/>
+  </w:num>
+  <w:num w:numId="7" w16cid:durableId="2018921608">
     <w:abstractNumId w:val="1"/>
-  </w:num>
-  <w:num w:numId="4" w16cid:durableId="1635788331">
-    <w:abstractNumId w:val="0"/>
   </w:num>
 </w:numbering>
 </file>
@@ -1729,6 +2318,28 @@
       <w:szCs w:val="32"/>
     </w:rPr>
   </w:style>
+  <w:style w:type="paragraph" w:styleId="Heading3">
+    <w:name w:val="heading 3"/>
+    <w:basedOn w:val="Normal"/>
+    <w:link w:val="Heading3Char"/>
+    <w:uiPriority w:val="9"/>
+    <w:qFormat/>
+    <w:rsid w:val="003D406E"/>
+    <w:pPr>
+      <w:spacing w:before="100" w:beforeAutospacing="1" w:after="100" w:afterAutospacing="1" w:line="240" w:lineRule="auto"/>
+      <w:outlineLvl w:val="2"/>
+    </w:pPr>
+    <w:rPr>
+      <w:rFonts w:ascii="Times New Roman" w:hAnsi="Times New Roman" w:cs="Times New Roman"/>
+      <w:b/>
+      <w:bCs/>
+      <w:kern w:val="2"/>
+      <w:sz w:val="27"/>
+      <w:szCs w:val="27"/>
+      <w:lang w:val="en-AU" w:eastAsia="en-AU"/>
+      <w14:ligatures w14:val="standardContextual"/>
+    </w:rPr>
+  </w:style>
   <w:style w:type="paragraph" w:styleId="Heading4">
     <w:name w:val="heading 4"/>
     <w:basedOn w:val="Normal"/>
@@ -1873,6 +2484,23 @@
     <w:rPr>
       <w:color w:val="96607D" w:themeColor="followedHyperlink"/>
       <w:u w:val="single"/>
+    </w:rPr>
+  </w:style>
+  <w:style w:type="character" w:customStyle="1" w:styleId="Heading3Char">
+    <w:name w:val="Heading 3 Char"/>
+    <w:basedOn w:val="DefaultParagraphFont"/>
+    <w:link w:val="Heading3"/>
+    <w:uiPriority w:val="9"/>
+    <w:rsid w:val="003D406E"/>
+    <w:rPr>
+      <w:rFonts w:ascii="Times New Roman" w:hAnsi="Times New Roman" w:cs="Times New Roman"/>
+      <w:b/>
+      <w:bCs/>
+      <w:kern w:val="2"/>
+      <w:sz w:val="27"/>
+      <w:szCs w:val="27"/>
+      <w:lang w:val="en-AU" w:eastAsia="en-AU"/>
+      <w14:ligatures w14:val="standardContextual"/>
     </w:rPr>
   </w:style>
 </w:styles>

</xml_diff>

<commit_message>
Analysis and reflection completed
</commit_message>
<xml_diff>
--- a/Portfolio/COMP6841_Week_2_z5425064.docx
+++ b/Portfolio/COMP6841_Week_2_z5425064.docx
@@ -785,11 +785,163 @@
           <w:tcPr>
             <w:tcW w:w="9360" w:type="dxa"/>
           </w:tcPr>
-          <w:p/>
-          <w:p/>
-          <w:p/>
-          <w:p/>
-          <w:p/>
+          <w:p>
+            <w:r>
+              <w:t xml:space="preserve">During the doors analysis the following key questions </w:t>
+            </w:r>
+            <w:r>
+              <w:t>were brought up for discussion:</w:t>
+            </w:r>
+          </w:p>
+          <w:p/>
+          <w:p>
+            <w:pPr>
+              <w:pStyle w:val="ListParagraph"/>
+              <w:numPr>
+                <w:ilvl w:val="0"/>
+                <w:numId w:val="8"/>
+              </w:numPr>
+              <w:rPr>
+                <w:b/>
+                <w:bCs/>
+              </w:rPr>
+            </w:pPr>
+            <w:r>
+              <w:rPr>
+                <w:b/>
+                <w:bCs/>
+              </w:rPr>
+              <w:t xml:space="preserve">What are the assets being protected by the </w:t>
+            </w:r>
+            <w:r>
+              <w:rPr>
+                <w:b/>
+                <w:bCs/>
+              </w:rPr>
+              <w:t>cockpit doors</w:t>
+            </w:r>
+            <w:r>
+              <w:rPr>
+                <w:b/>
+                <w:bCs/>
+              </w:rPr>
+              <w:t>?</w:t>
+            </w:r>
+          </w:p>
+          <w:p>
+            <w:pPr>
+              <w:pStyle w:val="ListParagraph"/>
+              <w:numPr>
+                <w:ilvl w:val="0"/>
+                <w:numId w:val="9"/>
+              </w:numPr>
+            </w:pPr>
+            <w:r>
+              <w:t>Most assets were agreed on by people including the pilots, cockpit controls, passenger’s safety, stewards, cargo and fuel</w:t>
+            </w:r>
+          </w:p>
+          <w:p>
+            <w:pPr>
+              <w:pStyle w:val="ListParagraph"/>
+              <w:numPr>
+                <w:ilvl w:val="0"/>
+                <w:numId w:val="9"/>
+              </w:numPr>
+            </w:pPr>
+            <w:r>
+              <w:t xml:space="preserve">One question was whether the protected assets should also include people or organisations that are not directly connected to the plane, such as people on </w:t>
+            </w:r>
+            <w:r>
+              <w:lastRenderedPageBreak/>
+              <w:t>the ground or the reputation of aviation authorities. I think they should be included, because even if the airline does not own these assets, it still has a duty to protect them if harm could be caused by something under its control and hence could also been seen as negligence from a legal aspect i</w:t>
+            </w:r>
+            <w:r>
+              <w:t>f</w:t>
+            </w:r>
+            <w:r>
+              <w:t xml:space="preserve"> these are not considered. </w:t>
+            </w:r>
+          </w:p>
+          <w:p>
+            <w:pPr>
+              <w:pStyle w:val="ListParagraph"/>
+              <w:numPr>
+                <w:ilvl w:val="0"/>
+                <w:numId w:val="8"/>
+              </w:numPr>
+              <w:rPr>
+                <w:b/>
+                <w:bCs/>
+              </w:rPr>
+            </w:pPr>
+            <w:r>
+              <w:rPr>
+                <w:b/>
+                <w:bCs/>
+              </w:rPr>
+              <w:t xml:space="preserve">What </w:t>
+            </w:r>
+            <w:r>
+              <w:rPr>
+                <w:b/>
+                <w:bCs/>
+              </w:rPr>
+              <w:t>improvements</w:t>
+            </w:r>
+            <w:r>
+              <w:rPr>
+                <w:b/>
+                <w:bCs/>
+              </w:rPr>
+              <w:t xml:space="preserve"> could be made to enhance the safety of plane?</w:t>
+            </w:r>
+          </w:p>
+          <w:p>
+            <w:pPr>
+              <w:pStyle w:val="ListParagraph"/>
+              <w:numPr>
+                <w:ilvl w:val="0"/>
+                <w:numId w:val="9"/>
+              </w:numPr>
+            </w:pPr>
+            <w:r>
+              <w:t xml:space="preserve">The first suggestion was to add a third pilot, with only one pilot allowed to leave at a time. I </w:t>
+            </w:r>
+            <w:r>
+              <w:t>disagree</w:t>
+            </w:r>
+            <w:r>
+              <w:t xml:space="preserve"> because two malicious pilots are not necessarily less likely than one, especially if one can coerce the other or both planned the action together. This could create a larger vulnerability. I would only support it if the third pilot was randomly assigned or had no prior relationship or conflict of interest with the others.</w:t>
+            </w:r>
+          </w:p>
+          <w:p>
+            <w:pPr>
+              <w:pStyle w:val="ListParagraph"/>
+              <w:numPr>
+                <w:ilvl w:val="0"/>
+                <w:numId w:val="9"/>
+              </w:numPr>
+            </w:pPr>
+            <w:r>
+              <w:t>Another suggestion was to let remote systems take over from a malicious pilot, recover the plane’s position, and protect everyone on board. Most people argued that this would create a new vulnerability by giving external attackers another possible way to access the aircraft. My view was slightly different. Autopilot systems already rely heavily on external data from GPS, radar, and gyroscopes to control the plane. If an attacker can feed false information into these sensors, they may be able to mislead the autopilot and indirectly influence the aircraft without needing full authorised access. This is similar to some CUAS attacks, where external signals are used to manipulate a system. In that sense, the current setup already has a type 1 weakness while trying to prevent a type 2 failure</w:t>
+            </w:r>
+            <w:r>
+              <w:t>, hence should be rebalanced by providing remote access.</w:t>
+            </w:r>
+          </w:p>
+          <w:p>
+            <w:pPr>
+              <w:pStyle w:val="ListParagraph"/>
+              <w:numPr>
+                <w:ilvl w:val="0"/>
+                <w:numId w:val="9"/>
+              </w:numPr>
+              <w:spacing w:after="160" w:line="279" w:lineRule="auto"/>
+            </w:pPr>
+            <w:r>
+              <w:t>Another proposal was to require two approvals before the cockpit door could be unlocked: one from a staff member and one from another person with a key. I mostly agreed with this because it adds a second judgement instead of relying on one person alone. To reduce the risk of coercion or pre-planning, I suggested that the second person should be randomly selected from authorised key holders on the plane. This would make it harder for attackers to predict or control who is involved. However, it could also increase the type 2 risk if a group of attackers stole keys and used them to force access to the cockpit.</w:t>
+            </w:r>
+          </w:p>
           <w:p/>
           <w:p/>
           <w:p/>
@@ -812,6 +964,7 @@
           <w:b/>
           <w:bCs/>
         </w:rPr>
+        <w:lastRenderedPageBreak/>
         <w:t xml:space="preserve">5. </w:t>
       </w:r>
       <w:r>
@@ -1187,6 +1340,357 @@
     </w:lvl>
   </w:abstractNum>
   <w:abstractNum w:abstractNumId="1" w15:restartNumberingAfterBreak="0">
+    <w:nsid w:val="09077F69"/>
+    <w:multiLevelType w:val="multilevel"/>
+    <w:tmpl w:val="65BE9EEA"/>
+    <w:lvl w:ilvl="0">
+      <w:start w:val="1"/>
+      <w:numFmt w:val="bullet"/>
+      <w:lvlText w:val=""/>
+      <w:lvlJc w:val="left"/>
+      <w:pPr>
+        <w:tabs>
+          <w:tab w:val="num" w:pos="720"/>
+        </w:tabs>
+        <w:ind w:left="720" w:hanging="360"/>
+      </w:pPr>
+      <w:rPr>
+        <w:rFonts w:ascii="Symbol" w:hAnsi="Symbol" w:hint="default"/>
+        <w:sz w:val="20"/>
+      </w:rPr>
+    </w:lvl>
+    <w:lvl w:ilvl="1" w:tentative="1">
+      <w:start w:val="1"/>
+      <w:numFmt w:val="bullet"/>
+      <w:lvlText w:val="o"/>
+      <w:lvlJc w:val="left"/>
+      <w:pPr>
+        <w:tabs>
+          <w:tab w:val="num" w:pos="1440"/>
+        </w:tabs>
+        <w:ind w:left="1440" w:hanging="360"/>
+      </w:pPr>
+      <w:rPr>
+        <w:rFonts w:ascii="Courier New" w:hAnsi="Courier New" w:hint="default"/>
+        <w:sz w:val="20"/>
+      </w:rPr>
+    </w:lvl>
+    <w:lvl w:ilvl="2" w:tentative="1">
+      <w:start w:val="1"/>
+      <w:numFmt w:val="bullet"/>
+      <w:lvlText w:val=""/>
+      <w:lvlJc w:val="left"/>
+      <w:pPr>
+        <w:tabs>
+          <w:tab w:val="num" w:pos="2160"/>
+        </w:tabs>
+        <w:ind w:left="2160" w:hanging="360"/>
+      </w:pPr>
+      <w:rPr>
+        <w:rFonts w:ascii="Wingdings" w:hAnsi="Wingdings" w:hint="default"/>
+        <w:sz w:val="20"/>
+      </w:rPr>
+    </w:lvl>
+    <w:lvl w:ilvl="3" w:tentative="1">
+      <w:start w:val="1"/>
+      <w:numFmt w:val="bullet"/>
+      <w:lvlText w:val=""/>
+      <w:lvlJc w:val="left"/>
+      <w:pPr>
+        <w:tabs>
+          <w:tab w:val="num" w:pos="2880"/>
+        </w:tabs>
+        <w:ind w:left="2880" w:hanging="360"/>
+      </w:pPr>
+      <w:rPr>
+        <w:rFonts w:ascii="Wingdings" w:hAnsi="Wingdings" w:hint="default"/>
+        <w:sz w:val="20"/>
+      </w:rPr>
+    </w:lvl>
+    <w:lvl w:ilvl="4" w:tentative="1">
+      <w:start w:val="1"/>
+      <w:numFmt w:val="bullet"/>
+      <w:lvlText w:val=""/>
+      <w:lvlJc w:val="left"/>
+      <w:pPr>
+        <w:tabs>
+          <w:tab w:val="num" w:pos="3600"/>
+        </w:tabs>
+        <w:ind w:left="3600" w:hanging="360"/>
+      </w:pPr>
+      <w:rPr>
+        <w:rFonts w:ascii="Wingdings" w:hAnsi="Wingdings" w:hint="default"/>
+        <w:sz w:val="20"/>
+      </w:rPr>
+    </w:lvl>
+    <w:lvl w:ilvl="5" w:tentative="1">
+      <w:start w:val="1"/>
+      <w:numFmt w:val="bullet"/>
+      <w:lvlText w:val=""/>
+      <w:lvlJc w:val="left"/>
+      <w:pPr>
+        <w:tabs>
+          <w:tab w:val="num" w:pos="4320"/>
+        </w:tabs>
+        <w:ind w:left="4320" w:hanging="360"/>
+      </w:pPr>
+      <w:rPr>
+        <w:rFonts w:ascii="Wingdings" w:hAnsi="Wingdings" w:hint="default"/>
+        <w:sz w:val="20"/>
+      </w:rPr>
+    </w:lvl>
+    <w:lvl w:ilvl="6" w:tentative="1">
+      <w:start w:val="1"/>
+      <w:numFmt w:val="bullet"/>
+      <w:lvlText w:val=""/>
+      <w:lvlJc w:val="left"/>
+      <w:pPr>
+        <w:tabs>
+          <w:tab w:val="num" w:pos="5040"/>
+        </w:tabs>
+        <w:ind w:left="5040" w:hanging="360"/>
+      </w:pPr>
+      <w:rPr>
+        <w:rFonts w:ascii="Wingdings" w:hAnsi="Wingdings" w:hint="default"/>
+        <w:sz w:val="20"/>
+      </w:rPr>
+    </w:lvl>
+    <w:lvl w:ilvl="7" w:tentative="1">
+      <w:start w:val="1"/>
+      <w:numFmt w:val="bullet"/>
+      <w:lvlText w:val=""/>
+      <w:lvlJc w:val="left"/>
+      <w:pPr>
+        <w:tabs>
+          <w:tab w:val="num" w:pos="5760"/>
+        </w:tabs>
+        <w:ind w:left="5760" w:hanging="360"/>
+      </w:pPr>
+      <w:rPr>
+        <w:rFonts w:ascii="Wingdings" w:hAnsi="Wingdings" w:hint="default"/>
+        <w:sz w:val="20"/>
+      </w:rPr>
+    </w:lvl>
+    <w:lvl w:ilvl="8" w:tentative="1">
+      <w:start w:val="1"/>
+      <w:numFmt w:val="bullet"/>
+      <w:lvlText w:val=""/>
+      <w:lvlJc w:val="left"/>
+      <w:pPr>
+        <w:tabs>
+          <w:tab w:val="num" w:pos="6480"/>
+        </w:tabs>
+        <w:ind w:left="6480" w:hanging="360"/>
+      </w:pPr>
+      <w:rPr>
+        <w:rFonts w:ascii="Wingdings" w:hAnsi="Wingdings" w:hint="default"/>
+        <w:sz w:val="20"/>
+      </w:rPr>
+    </w:lvl>
+  </w:abstractNum>
+  <w:abstractNum w:abstractNumId="2" w15:restartNumberingAfterBreak="0">
+    <w:nsid w:val="0BD76563"/>
+    <w:multiLevelType w:val="hybridMultilevel"/>
+    <w:tmpl w:val="AE76637E"/>
+    <w:lvl w:ilvl="0" w:tplc="1D5A5A68">
+      <w:start w:val="1"/>
+      <w:numFmt w:val="bullet"/>
+      <w:lvlText w:val="-"/>
+      <w:lvlJc w:val="left"/>
+      <w:pPr>
+        <w:ind w:left="1080" w:hanging="360"/>
+      </w:pPr>
+      <w:rPr>
+        <w:rFonts w:ascii="Aptos" w:eastAsiaTheme="minorEastAsia" w:hAnsi="Aptos" w:cstheme="minorBidi" w:hint="default"/>
+      </w:rPr>
+    </w:lvl>
+    <w:lvl w:ilvl="1" w:tplc="0C090003" w:tentative="1">
+      <w:start w:val="1"/>
+      <w:numFmt w:val="bullet"/>
+      <w:lvlText w:val="o"/>
+      <w:lvlJc w:val="left"/>
+      <w:pPr>
+        <w:ind w:left="1800" w:hanging="360"/>
+      </w:pPr>
+      <w:rPr>
+        <w:rFonts w:ascii="Courier New" w:hAnsi="Courier New" w:cs="Courier New" w:hint="default"/>
+      </w:rPr>
+    </w:lvl>
+    <w:lvl w:ilvl="2" w:tplc="0C090005" w:tentative="1">
+      <w:start w:val="1"/>
+      <w:numFmt w:val="bullet"/>
+      <w:lvlText w:val=""/>
+      <w:lvlJc w:val="left"/>
+      <w:pPr>
+        <w:ind w:left="2520" w:hanging="360"/>
+      </w:pPr>
+      <w:rPr>
+        <w:rFonts w:ascii="Wingdings" w:hAnsi="Wingdings" w:hint="default"/>
+      </w:rPr>
+    </w:lvl>
+    <w:lvl w:ilvl="3" w:tplc="0C090001" w:tentative="1">
+      <w:start w:val="1"/>
+      <w:numFmt w:val="bullet"/>
+      <w:lvlText w:val=""/>
+      <w:lvlJc w:val="left"/>
+      <w:pPr>
+        <w:ind w:left="3240" w:hanging="360"/>
+      </w:pPr>
+      <w:rPr>
+        <w:rFonts w:ascii="Symbol" w:hAnsi="Symbol" w:hint="default"/>
+      </w:rPr>
+    </w:lvl>
+    <w:lvl w:ilvl="4" w:tplc="0C090003" w:tentative="1">
+      <w:start w:val="1"/>
+      <w:numFmt w:val="bullet"/>
+      <w:lvlText w:val="o"/>
+      <w:lvlJc w:val="left"/>
+      <w:pPr>
+        <w:ind w:left="3960" w:hanging="360"/>
+      </w:pPr>
+      <w:rPr>
+        <w:rFonts w:ascii="Courier New" w:hAnsi="Courier New" w:cs="Courier New" w:hint="default"/>
+      </w:rPr>
+    </w:lvl>
+    <w:lvl w:ilvl="5" w:tplc="0C090005" w:tentative="1">
+      <w:start w:val="1"/>
+      <w:numFmt w:val="bullet"/>
+      <w:lvlText w:val=""/>
+      <w:lvlJc w:val="left"/>
+      <w:pPr>
+        <w:ind w:left="4680" w:hanging="360"/>
+      </w:pPr>
+      <w:rPr>
+        <w:rFonts w:ascii="Wingdings" w:hAnsi="Wingdings" w:hint="default"/>
+      </w:rPr>
+    </w:lvl>
+    <w:lvl w:ilvl="6" w:tplc="0C090001" w:tentative="1">
+      <w:start w:val="1"/>
+      <w:numFmt w:val="bullet"/>
+      <w:lvlText w:val=""/>
+      <w:lvlJc w:val="left"/>
+      <w:pPr>
+        <w:ind w:left="5400" w:hanging="360"/>
+      </w:pPr>
+      <w:rPr>
+        <w:rFonts w:ascii="Symbol" w:hAnsi="Symbol" w:hint="default"/>
+      </w:rPr>
+    </w:lvl>
+    <w:lvl w:ilvl="7" w:tplc="0C090003" w:tentative="1">
+      <w:start w:val="1"/>
+      <w:numFmt w:val="bullet"/>
+      <w:lvlText w:val="o"/>
+      <w:lvlJc w:val="left"/>
+      <w:pPr>
+        <w:ind w:left="6120" w:hanging="360"/>
+      </w:pPr>
+      <w:rPr>
+        <w:rFonts w:ascii="Courier New" w:hAnsi="Courier New" w:cs="Courier New" w:hint="default"/>
+      </w:rPr>
+    </w:lvl>
+    <w:lvl w:ilvl="8" w:tplc="0C090005" w:tentative="1">
+      <w:start w:val="1"/>
+      <w:numFmt w:val="bullet"/>
+      <w:lvlText w:val=""/>
+      <w:lvlJc w:val="left"/>
+      <w:pPr>
+        <w:ind w:left="6840" w:hanging="360"/>
+      </w:pPr>
+      <w:rPr>
+        <w:rFonts w:ascii="Wingdings" w:hAnsi="Wingdings" w:hint="default"/>
+      </w:rPr>
+    </w:lvl>
+  </w:abstractNum>
+  <w:abstractNum w:abstractNumId="3" w15:restartNumberingAfterBreak="0">
+    <w:nsid w:val="0E8959D7"/>
+    <w:multiLevelType w:val="hybridMultilevel"/>
+    <w:tmpl w:val="BC42D180"/>
+    <w:lvl w:ilvl="0" w:tplc="0C09000F">
+      <w:start w:val="1"/>
+      <w:numFmt w:val="decimal"/>
+      <w:lvlText w:val="%1."/>
+      <w:lvlJc w:val="left"/>
+      <w:pPr>
+        <w:ind w:left="720" w:hanging="360"/>
+      </w:pPr>
+      <w:rPr>
+        <w:rFonts w:hint="default"/>
+      </w:rPr>
+    </w:lvl>
+    <w:lvl w:ilvl="1" w:tplc="0C090019" w:tentative="1">
+      <w:start w:val="1"/>
+      <w:numFmt w:val="lowerLetter"/>
+      <w:lvlText w:val="%2."/>
+      <w:lvlJc w:val="left"/>
+      <w:pPr>
+        <w:ind w:left="1440" w:hanging="360"/>
+      </w:pPr>
+    </w:lvl>
+    <w:lvl w:ilvl="2" w:tplc="0C09001B" w:tentative="1">
+      <w:start w:val="1"/>
+      <w:numFmt w:val="lowerRoman"/>
+      <w:lvlText w:val="%3."/>
+      <w:lvlJc w:val="right"/>
+      <w:pPr>
+        <w:ind w:left="2160" w:hanging="180"/>
+      </w:pPr>
+    </w:lvl>
+    <w:lvl w:ilvl="3" w:tplc="0C09000F" w:tentative="1">
+      <w:start w:val="1"/>
+      <w:numFmt w:val="decimal"/>
+      <w:lvlText w:val="%4."/>
+      <w:lvlJc w:val="left"/>
+      <w:pPr>
+        <w:ind w:left="2880" w:hanging="360"/>
+      </w:pPr>
+    </w:lvl>
+    <w:lvl w:ilvl="4" w:tplc="0C090019" w:tentative="1">
+      <w:start w:val="1"/>
+      <w:numFmt w:val="lowerLetter"/>
+      <w:lvlText w:val="%5."/>
+      <w:lvlJc w:val="left"/>
+      <w:pPr>
+        <w:ind w:left="3600" w:hanging="360"/>
+      </w:pPr>
+    </w:lvl>
+    <w:lvl w:ilvl="5" w:tplc="0C09001B" w:tentative="1">
+      <w:start w:val="1"/>
+      <w:numFmt w:val="lowerRoman"/>
+      <w:lvlText w:val="%6."/>
+      <w:lvlJc w:val="right"/>
+      <w:pPr>
+        <w:ind w:left="4320" w:hanging="180"/>
+      </w:pPr>
+    </w:lvl>
+    <w:lvl w:ilvl="6" w:tplc="0C09000F" w:tentative="1">
+      <w:start w:val="1"/>
+      <w:numFmt w:val="decimal"/>
+      <w:lvlText w:val="%7."/>
+      <w:lvlJc w:val="left"/>
+      <w:pPr>
+        <w:ind w:left="5040" w:hanging="360"/>
+      </w:pPr>
+    </w:lvl>
+    <w:lvl w:ilvl="7" w:tplc="0C090019" w:tentative="1">
+      <w:start w:val="1"/>
+      <w:numFmt w:val="lowerLetter"/>
+      <w:lvlText w:val="%8."/>
+      <w:lvlJc w:val="left"/>
+      <w:pPr>
+        <w:ind w:left="5760" w:hanging="360"/>
+      </w:pPr>
+    </w:lvl>
+    <w:lvl w:ilvl="8" w:tplc="0C09001B" w:tentative="1">
+      <w:start w:val="1"/>
+      <w:numFmt w:val="lowerRoman"/>
+      <w:lvlText w:val="%9."/>
+      <w:lvlJc w:val="right"/>
+      <w:pPr>
+        <w:ind w:left="6480" w:hanging="180"/>
+      </w:pPr>
+    </w:lvl>
+  </w:abstractNum>
+  <w:abstractNum w:abstractNumId="4" w15:restartNumberingAfterBreak="0">
     <w:nsid w:val="0FE73F10"/>
     <w:multiLevelType w:val="multilevel"/>
     <w:tmpl w:val="025616CC"/>
@@ -1335,7 +1839,7 @@
       </w:rPr>
     </w:lvl>
   </w:abstractNum>
-  <w:abstractNum w:abstractNumId="2" w15:restartNumberingAfterBreak="0">
+  <w:abstractNum w:abstractNumId="5" w15:restartNumberingAfterBreak="0">
     <w:nsid w:val="15132DEC"/>
     <w:multiLevelType w:val="hybridMultilevel"/>
     <w:tmpl w:val="4E021DBA"/>
@@ -1447,7 +1951,7 @@
       </w:rPr>
     </w:lvl>
   </w:abstractNum>
-  <w:abstractNum w:abstractNumId="3" w15:restartNumberingAfterBreak="0">
+  <w:abstractNum w:abstractNumId="6" w15:restartNumberingAfterBreak="0">
     <w:nsid w:val="4923DB14"/>
     <w:multiLevelType w:val="hybridMultilevel"/>
     <w:tmpl w:val="2AA69DEE"/>
@@ -1533,7 +2037,156 @@
       </w:pPr>
     </w:lvl>
   </w:abstractNum>
-  <w:abstractNum w:abstractNumId="4" w15:restartNumberingAfterBreak="0">
+  <w:abstractNum w:abstractNumId="7" w15:restartNumberingAfterBreak="0">
+    <w:nsid w:val="4A403892"/>
+    <w:multiLevelType w:val="multilevel"/>
+    <w:tmpl w:val="EE9A3F8E"/>
+    <w:lvl w:ilvl="0">
+      <w:start w:val="1"/>
+      <w:numFmt w:val="bullet"/>
+      <w:lvlText w:val=""/>
+      <w:lvlJc w:val="left"/>
+      <w:pPr>
+        <w:tabs>
+          <w:tab w:val="num" w:pos="720"/>
+        </w:tabs>
+        <w:ind w:left="720" w:hanging="360"/>
+      </w:pPr>
+      <w:rPr>
+        <w:rFonts w:ascii="Symbol" w:hAnsi="Symbol" w:hint="default"/>
+        <w:sz w:val="20"/>
+      </w:rPr>
+    </w:lvl>
+    <w:lvl w:ilvl="1" w:tentative="1">
+      <w:start w:val="1"/>
+      <w:numFmt w:val="bullet"/>
+      <w:lvlText w:val="o"/>
+      <w:lvlJc w:val="left"/>
+      <w:pPr>
+        <w:tabs>
+          <w:tab w:val="num" w:pos="1440"/>
+        </w:tabs>
+        <w:ind w:left="1440" w:hanging="360"/>
+      </w:pPr>
+      <w:rPr>
+        <w:rFonts w:ascii="Courier New" w:hAnsi="Courier New" w:hint="default"/>
+        <w:sz w:val="20"/>
+      </w:rPr>
+    </w:lvl>
+    <w:lvl w:ilvl="2" w:tentative="1">
+      <w:start w:val="1"/>
+      <w:numFmt w:val="bullet"/>
+      <w:lvlText w:val=""/>
+      <w:lvlJc w:val="left"/>
+      <w:pPr>
+        <w:tabs>
+          <w:tab w:val="num" w:pos="2160"/>
+        </w:tabs>
+        <w:ind w:left="2160" w:hanging="360"/>
+      </w:pPr>
+      <w:rPr>
+        <w:rFonts w:ascii="Wingdings" w:hAnsi="Wingdings" w:hint="default"/>
+        <w:sz w:val="20"/>
+      </w:rPr>
+    </w:lvl>
+    <w:lvl w:ilvl="3" w:tentative="1">
+      <w:start w:val="1"/>
+      <w:numFmt w:val="bullet"/>
+      <w:lvlText w:val=""/>
+      <w:lvlJc w:val="left"/>
+      <w:pPr>
+        <w:tabs>
+          <w:tab w:val="num" w:pos="2880"/>
+        </w:tabs>
+        <w:ind w:left="2880" w:hanging="360"/>
+      </w:pPr>
+      <w:rPr>
+        <w:rFonts w:ascii="Wingdings" w:hAnsi="Wingdings" w:hint="default"/>
+        <w:sz w:val="20"/>
+      </w:rPr>
+    </w:lvl>
+    <w:lvl w:ilvl="4" w:tentative="1">
+      <w:start w:val="1"/>
+      <w:numFmt w:val="bullet"/>
+      <w:lvlText w:val=""/>
+      <w:lvlJc w:val="left"/>
+      <w:pPr>
+        <w:tabs>
+          <w:tab w:val="num" w:pos="3600"/>
+        </w:tabs>
+        <w:ind w:left="3600" w:hanging="360"/>
+      </w:pPr>
+      <w:rPr>
+        <w:rFonts w:ascii="Wingdings" w:hAnsi="Wingdings" w:hint="default"/>
+        <w:sz w:val="20"/>
+      </w:rPr>
+    </w:lvl>
+    <w:lvl w:ilvl="5" w:tentative="1">
+      <w:start w:val="1"/>
+      <w:numFmt w:val="bullet"/>
+      <w:lvlText w:val=""/>
+      <w:lvlJc w:val="left"/>
+      <w:pPr>
+        <w:tabs>
+          <w:tab w:val="num" w:pos="4320"/>
+        </w:tabs>
+        <w:ind w:left="4320" w:hanging="360"/>
+      </w:pPr>
+      <w:rPr>
+        <w:rFonts w:ascii="Wingdings" w:hAnsi="Wingdings" w:hint="default"/>
+        <w:sz w:val="20"/>
+      </w:rPr>
+    </w:lvl>
+    <w:lvl w:ilvl="6" w:tentative="1">
+      <w:start w:val="1"/>
+      <w:numFmt w:val="bullet"/>
+      <w:lvlText w:val=""/>
+      <w:lvlJc w:val="left"/>
+      <w:pPr>
+        <w:tabs>
+          <w:tab w:val="num" w:pos="5040"/>
+        </w:tabs>
+        <w:ind w:left="5040" w:hanging="360"/>
+      </w:pPr>
+      <w:rPr>
+        <w:rFonts w:ascii="Wingdings" w:hAnsi="Wingdings" w:hint="default"/>
+        <w:sz w:val="20"/>
+      </w:rPr>
+    </w:lvl>
+    <w:lvl w:ilvl="7" w:tentative="1">
+      <w:start w:val="1"/>
+      <w:numFmt w:val="bullet"/>
+      <w:lvlText w:val=""/>
+      <w:lvlJc w:val="left"/>
+      <w:pPr>
+        <w:tabs>
+          <w:tab w:val="num" w:pos="5760"/>
+        </w:tabs>
+        <w:ind w:left="5760" w:hanging="360"/>
+      </w:pPr>
+      <w:rPr>
+        <w:rFonts w:ascii="Wingdings" w:hAnsi="Wingdings" w:hint="default"/>
+        <w:sz w:val="20"/>
+      </w:rPr>
+    </w:lvl>
+    <w:lvl w:ilvl="8" w:tentative="1">
+      <w:start w:val="1"/>
+      <w:numFmt w:val="bullet"/>
+      <w:lvlText w:val=""/>
+      <w:lvlJc w:val="left"/>
+      <w:pPr>
+        <w:tabs>
+          <w:tab w:val="num" w:pos="6480"/>
+        </w:tabs>
+        <w:ind w:left="6480" w:hanging="360"/>
+      </w:pPr>
+      <w:rPr>
+        <w:rFonts w:ascii="Wingdings" w:hAnsi="Wingdings" w:hint="default"/>
+        <w:sz w:val="20"/>
+      </w:rPr>
+    </w:lvl>
+  </w:abstractNum>
+  <w:abstractNum w:abstractNumId="8" w15:restartNumberingAfterBreak="0">
     <w:nsid w:val="4C900651"/>
     <w:multiLevelType w:val="multilevel"/>
     <w:tmpl w:val="1820E766"/>
@@ -1682,7 +2335,7 @@
       </w:rPr>
     </w:lvl>
   </w:abstractNum>
-  <w:abstractNum w:abstractNumId="5" w15:restartNumberingAfterBreak="0">
+  <w:abstractNum w:abstractNumId="9" w15:restartNumberingAfterBreak="0">
     <w:nsid w:val="59204C81"/>
     <w:multiLevelType w:val="hybridMultilevel"/>
     <w:tmpl w:val="00620D24"/>
@@ -1768,7 +2421,305 @@
       </w:pPr>
     </w:lvl>
   </w:abstractNum>
-  <w:abstractNum w:abstractNumId="6" w15:restartNumberingAfterBreak="0">
+  <w:abstractNum w:abstractNumId="10" w15:restartNumberingAfterBreak="0">
+    <w:nsid w:val="5D4F6D79"/>
+    <w:multiLevelType w:val="multilevel"/>
+    <w:tmpl w:val="13248B4A"/>
+    <w:lvl w:ilvl="0">
+      <w:start w:val="1"/>
+      <w:numFmt w:val="bullet"/>
+      <w:lvlText w:val=""/>
+      <w:lvlJc w:val="left"/>
+      <w:pPr>
+        <w:tabs>
+          <w:tab w:val="num" w:pos="720"/>
+        </w:tabs>
+        <w:ind w:left="720" w:hanging="360"/>
+      </w:pPr>
+      <w:rPr>
+        <w:rFonts w:ascii="Symbol" w:hAnsi="Symbol" w:hint="default"/>
+        <w:sz w:val="20"/>
+      </w:rPr>
+    </w:lvl>
+    <w:lvl w:ilvl="1" w:tentative="1">
+      <w:start w:val="1"/>
+      <w:numFmt w:val="bullet"/>
+      <w:lvlText w:val="o"/>
+      <w:lvlJc w:val="left"/>
+      <w:pPr>
+        <w:tabs>
+          <w:tab w:val="num" w:pos="1440"/>
+        </w:tabs>
+        <w:ind w:left="1440" w:hanging="360"/>
+      </w:pPr>
+      <w:rPr>
+        <w:rFonts w:ascii="Courier New" w:hAnsi="Courier New" w:hint="default"/>
+        <w:sz w:val="20"/>
+      </w:rPr>
+    </w:lvl>
+    <w:lvl w:ilvl="2" w:tentative="1">
+      <w:start w:val="1"/>
+      <w:numFmt w:val="bullet"/>
+      <w:lvlText w:val=""/>
+      <w:lvlJc w:val="left"/>
+      <w:pPr>
+        <w:tabs>
+          <w:tab w:val="num" w:pos="2160"/>
+        </w:tabs>
+        <w:ind w:left="2160" w:hanging="360"/>
+      </w:pPr>
+      <w:rPr>
+        <w:rFonts w:ascii="Wingdings" w:hAnsi="Wingdings" w:hint="default"/>
+        <w:sz w:val="20"/>
+      </w:rPr>
+    </w:lvl>
+    <w:lvl w:ilvl="3" w:tentative="1">
+      <w:start w:val="1"/>
+      <w:numFmt w:val="bullet"/>
+      <w:lvlText w:val=""/>
+      <w:lvlJc w:val="left"/>
+      <w:pPr>
+        <w:tabs>
+          <w:tab w:val="num" w:pos="2880"/>
+        </w:tabs>
+        <w:ind w:left="2880" w:hanging="360"/>
+      </w:pPr>
+      <w:rPr>
+        <w:rFonts w:ascii="Wingdings" w:hAnsi="Wingdings" w:hint="default"/>
+        <w:sz w:val="20"/>
+      </w:rPr>
+    </w:lvl>
+    <w:lvl w:ilvl="4" w:tentative="1">
+      <w:start w:val="1"/>
+      <w:numFmt w:val="bullet"/>
+      <w:lvlText w:val=""/>
+      <w:lvlJc w:val="left"/>
+      <w:pPr>
+        <w:tabs>
+          <w:tab w:val="num" w:pos="3600"/>
+        </w:tabs>
+        <w:ind w:left="3600" w:hanging="360"/>
+      </w:pPr>
+      <w:rPr>
+        <w:rFonts w:ascii="Wingdings" w:hAnsi="Wingdings" w:hint="default"/>
+        <w:sz w:val="20"/>
+      </w:rPr>
+    </w:lvl>
+    <w:lvl w:ilvl="5" w:tentative="1">
+      <w:start w:val="1"/>
+      <w:numFmt w:val="bullet"/>
+      <w:lvlText w:val=""/>
+      <w:lvlJc w:val="left"/>
+      <w:pPr>
+        <w:tabs>
+          <w:tab w:val="num" w:pos="4320"/>
+        </w:tabs>
+        <w:ind w:left="4320" w:hanging="360"/>
+      </w:pPr>
+      <w:rPr>
+        <w:rFonts w:ascii="Wingdings" w:hAnsi="Wingdings" w:hint="default"/>
+        <w:sz w:val="20"/>
+      </w:rPr>
+    </w:lvl>
+    <w:lvl w:ilvl="6" w:tentative="1">
+      <w:start w:val="1"/>
+      <w:numFmt w:val="bullet"/>
+      <w:lvlText w:val=""/>
+      <w:lvlJc w:val="left"/>
+      <w:pPr>
+        <w:tabs>
+          <w:tab w:val="num" w:pos="5040"/>
+        </w:tabs>
+        <w:ind w:left="5040" w:hanging="360"/>
+      </w:pPr>
+      <w:rPr>
+        <w:rFonts w:ascii="Wingdings" w:hAnsi="Wingdings" w:hint="default"/>
+        <w:sz w:val="20"/>
+      </w:rPr>
+    </w:lvl>
+    <w:lvl w:ilvl="7" w:tentative="1">
+      <w:start w:val="1"/>
+      <w:numFmt w:val="bullet"/>
+      <w:lvlText w:val=""/>
+      <w:lvlJc w:val="left"/>
+      <w:pPr>
+        <w:tabs>
+          <w:tab w:val="num" w:pos="5760"/>
+        </w:tabs>
+        <w:ind w:left="5760" w:hanging="360"/>
+      </w:pPr>
+      <w:rPr>
+        <w:rFonts w:ascii="Wingdings" w:hAnsi="Wingdings" w:hint="default"/>
+        <w:sz w:val="20"/>
+      </w:rPr>
+    </w:lvl>
+    <w:lvl w:ilvl="8" w:tentative="1">
+      <w:start w:val="1"/>
+      <w:numFmt w:val="bullet"/>
+      <w:lvlText w:val=""/>
+      <w:lvlJc w:val="left"/>
+      <w:pPr>
+        <w:tabs>
+          <w:tab w:val="num" w:pos="6480"/>
+        </w:tabs>
+        <w:ind w:left="6480" w:hanging="360"/>
+      </w:pPr>
+      <w:rPr>
+        <w:rFonts w:ascii="Wingdings" w:hAnsi="Wingdings" w:hint="default"/>
+        <w:sz w:val="20"/>
+      </w:rPr>
+    </w:lvl>
+  </w:abstractNum>
+  <w:abstractNum w:abstractNumId="11" w15:restartNumberingAfterBreak="0">
+    <w:nsid w:val="672538EC"/>
+    <w:multiLevelType w:val="multilevel"/>
+    <w:tmpl w:val="01462E50"/>
+    <w:lvl w:ilvl="0">
+      <w:start w:val="1"/>
+      <w:numFmt w:val="bullet"/>
+      <w:lvlText w:val=""/>
+      <w:lvlJc w:val="left"/>
+      <w:pPr>
+        <w:tabs>
+          <w:tab w:val="num" w:pos="720"/>
+        </w:tabs>
+        <w:ind w:left="720" w:hanging="360"/>
+      </w:pPr>
+      <w:rPr>
+        <w:rFonts w:ascii="Symbol" w:hAnsi="Symbol" w:hint="default"/>
+        <w:sz w:val="20"/>
+      </w:rPr>
+    </w:lvl>
+    <w:lvl w:ilvl="1" w:tentative="1">
+      <w:start w:val="1"/>
+      <w:numFmt w:val="bullet"/>
+      <w:lvlText w:val="o"/>
+      <w:lvlJc w:val="left"/>
+      <w:pPr>
+        <w:tabs>
+          <w:tab w:val="num" w:pos="1440"/>
+        </w:tabs>
+        <w:ind w:left="1440" w:hanging="360"/>
+      </w:pPr>
+      <w:rPr>
+        <w:rFonts w:ascii="Courier New" w:hAnsi="Courier New" w:hint="default"/>
+        <w:sz w:val="20"/>
+      </w:rPr>
+    </w:lvl>
+    <w:lvl w:ilvl="2" w:tentative="1">
+      <w:start w:val="1"/>
+      <w:numFmt w:val="bullet"/>
+      <w:lvlText w:val=""/>
+      <w:lvlJc w:val="left"/>
+      <w:pPr>
+        <w:tabs>
+          <w:tab w:val="num" w:pos="2160"/>
+        </w:tabs>
+        <w:ind w:left="2160" w:hanging="360"/>
+      </w:pPr>
+      <w:rPr>
+        <w:rFonts w:ascii="Wingdings" w:hAnsi="Wingdings" w:hint="default"/>
+        <w:sz w:val="20"/>
+      </w:rPr>
+    </w:lvl>
+    <w:lvl w:ilvl="3" w:tentative="1">
+      <w:start w:val="1"/>
+      <w:numFmt w:val="bullet"/>
+      <w:lvlText w:val=""/>
+      <w:lvlJc w:val="left"/>
+      <w:pPr>
+        <w:tabs>
+          <w:tab w:val="num" w:pos="2880"/>
+        </w:tabs>
+        <w:ind w:left="2880" w:hanging="360"/>
+      </w:pPr>
+      <w:rPr>
+        <w:rFonts w:ascii="Wingdings" w:hAnsi="Wingdings" w:hint="default"/>
+        <w:sz w:val="20"/>
+      </w:rPr>
+    </w:lvl>
+    <w:lvl w:ilvl="4" w:tentative="1">
+      <w:start w:val="1"/>
+      <w:numFmt w:val="bullet"/>
+      <w:lvlText w:val=""/>
+      <w:lvlJc w:val="left"/>
+      <w:pPr>
+        <w:tabs>
+          <w:tab w:val="num" w:pos="3600"/>
+        </w:tabs>
+        <w:ind w:left="3600" w:hanging="360"/>
+      </w:pPr>
+      <w:rPr>
+        <w:rFonts w:ascii="Wingdings" w:hAnsi="Wingdings" w:hint="default"/>
+        <w:sz w:val="20"/>
+      </w:rPr>
+    </w:lvl>
+    <w:lvl w:ilvl="5" w:tentative="1">
+      <w:start w:val="1"/>
+      <w:numFmt w:val="bullet"/>
+      <w:lvlText w:val=""/>
+      <w:lvlJc w:val="left"/>
+      <w:pPr>
+        <w:tabs>
+          <w:tab w:val="num" w:pos="4320"/>
+        </w:tabs>
+        <w:ind w:left="4320" w:hanging="360"/>
+      </w:pPr>
+      <w:rPr>
+        <w:rFonts w:ascii="Wingdings" w:hAnsi="Wingdings" w:hint="default"/>
+        <w:sz w:val="20"/>
+      </w:rPr>
+    </w:lvl>
+    <w:lvl w:ilvl="6" w:tentative="1">
+      <w:start w:val="1"/>
+      <w:numFmt w:val="bullet"/>
+      <w:lvlText w:val=""/>
+      <w:lvlJc w:val="left"/>
+      <w:pPr>
+        <w:tabs>
+          <w:tab w:val="num" w:pos="5040"/>
+        </w:tabs>
+        <w:ind w:left="5040" w:hanging="360"/>
+      </w:pPr>
+      <w:rPr>
+        <w:rFonts w:ascii="Wingdings" w:hAnsi="Wingdings" w:hint="default"/>
+        <w:sz w:val="20"/>
+      </w:rPr>
+    </w:lvl>
+    <w:lvl w:ilvl="7" w:tentative="1">
+      <w:start w:val="1"/>
+      <w:numFmt w:val="bullet"/>
+      <w:lvlText w:val=""/>
+      <w:lvlJc w:val="left"/>
+      <w:pPr>
+        <w:tabs>
+          <w:tab w:val="num" w:pos="5760"/>
+        </w:tabs>
+        <w:ind w:left="5760" w:hanging="360"/>
+      </w:pPr>
+      <w:rPr>
+        <w:rFonts w:ascii="Wingdings" w:hAnsi="Wingdings" w:hint="default"/>
+        <w:sz w:val="20"/>
+      </w:rPr>
+    </w:lvl>
+    <w:lvl w:ilvl="8" w:tentative="1">
+      <w:start w:val="1"/>
+      <w:numFmt w:val="bullet"/>
+      <w:lvlText w:val=""/>
+      <w:lvlJc w:val="left"/>
+      <w:pPr>
+        <w:tabs>
+          <w:tab w:val="num" w:pos="6480"/>
+        </w:tabs>
+        <w:ind w:left="6480" w:hanging="360"/>
+      </w:pPr>
+      <w:rPr>
+        <w:rFonts w:ascii="Wingdings" w:hAnsi="Wingdings" w:hint="default"/>
+        <w:sz w:val="20"/>
+      </w:rPr>
+    </w:lvl>
+  </w:abstractNum>
+  <w:abstractNum w:abstractNumId="12" w15:restartNumberingAfterBreak="0">
     <w:nsid w:val="786060C3"/>
     <w:multiLevelType w:val="hybridMultilevel"/>
     <w:tmpl w:val="45F419B8"/>
@@ -1855,25 +2806,43 @@
     </w:lvl>
   </w:abstractNum>
   <w:num w:numId="1" w16cid:durableId="844052501">
+    <w:abstractNumId w:val="12"/>
+  </w:num>
+  <w:num w:numId="2" w16cid:durableId="226889906">
+    <w:abstractNumId w:val="9"/>
+  </w:num>
+  <w:num w:numId="3" w16cid:durableId="1325090021">
     <w:abstractNumId w:val="6"/>
   </w:num>
-  <w:num w:numId="2" w16cid:durableId="226889906">
+  <w:num w:numId="4" w16cid:durableId="1635788331">
     <w:abstractNumId w:val="5"/>
-  </w:num>
-  <w:num w:numId="3" w16cid:durableId="1325090021">
-    <w:abstractNumId w:val="3"/>
-  </w:num>
-  <w:num w:numId="4" w16cid:durableId="1635788331">
-    <w:abstractNumId w:val="2"/>
   </w:num>
   <w:num w:numId="5" w16cid:durableId="488137113">
     <w:abstractNumId w:val="0"/>
   </w:num>
   <w:num w:numId="6" w16cid:durableId="1815373947">
+    <w:abstractNumId w:val="8"/>
+  </w:num>
+  <w:num w:numId="7" w16cid:durableId="2018921608">
     <w:abstractNumId w:val="4"/>
   </w:num>
-  <w:num w:numId="7" w16cid:durableId="2018921608">
+  <w:num w:numId="8" w16cid:durableId="635112934">
+    <w:abstractNumId w:val="3"/>
+  </w:num>
+  <w:num w:numId="9" w16cid:durableId="1243491988">
+    <w:abstractNumId w:val="2"/>
+  </w:num>
+  <w:num w:numId="10" w16cid:durableId="291253320">
+    <w:abstractNumId w:val="11"/>
+  </w:num>
+  <w:num w:numId="11" w16cid:durableId="1924870691">
     <w:abstractNumId w:val="1"/>
+  </w:num>
+  <w:num w:numId="12" w16cid:durableId="380979341">
+    <w:abstractNumId w:val="10"/>
+  </w:num>
+  <w:num w:numId="13" w16cid:durableId="1292243294">
+    <w:abstractNumId w:val="7"/>
   </w:num>
 </w:numbering>
 </file>

</xml_diff>

<commit_message>
Security Everywhere Section Written Up
</commit_message>
<xml_diff>
--- a/Portfolio/COMP6841_Week_2_z5425064.docx
+++ b/Portfolio/COMP6841_Week_2_z5425064.docx
@@ -72,15 +72,6 @@
         </w:rPr>
         <w:t xml:space="preserve">Name: </w:t>
       </w:r>
-    </w:p>
-    <w:p>
-      <w:pPr>
-        <w:spacing w:after="0" w:line="240" w:lineRule="auto"/>
-        <w:rPr>
-          <w:rFonts w:ascii="Aptos" w:eastAsia="Aptos" w:hAnsi="Aptos" w:cs="Aptos"/>
-          <w:color w:val="000000" w:themeColor="text1"/>
-        </w:rPr>
-      </w:pPr>
       <w:r>
         <w:rPr>
           <w:rFonts w:ascii="Aptos" w:eastAsia="Aptos" w:hAnsi="Aptos" w:cs="Aptos"/>
@@ -88,7 +79,45 @@
           <w:bCs/>
           <w:color w:val="000000" w:themeColor="text1"/>
         </w:rPr>
-        <w:t>zID:</w:t>
+        <w:t>Thomas Gosman</w:t>
+      </w:r>
+    </w:p>
+    <w:p>
+      <w:pPr>
+        <w:spacing w:after="0" w:line="240" w:lineRule="auto"/>
+        <w:rPr>
+          <w:rFonts w:ascii="Aptos" w:eastAsia="Aptos" w:hAnsi="Aptos" w:cs="Aptos"/>
+          <w:color w:val="000000" w:themeColor="text1"/>
+        </w:rPr>
+      </w:pPr>
+      <w:proofErr w:type="spellStart"/>
+      <w:r>
+        <w:rPr>
+          <w:rFonts w:ascii="Aptos" w:eastAsia="Aptos" w:hAnsi="Aptos" w:cs="Aptos"/>
+          <w:b/>
+          <w:bCs/>
+          <w:color w:val="000000" w:themeColor="text1"/>
+        </w:rPr>
+        <w:t>zID</w:t>
+      </w:r>
+      <w:proofErr w:type="spellEnd"/>
+      <w:r>
+        <w:rPr>
+          <w:rFonts w:ascii="Aptos" w:eastAsia="Aptos" w:hAnsi="Aptos" w:cs="Aptos"/>
+          <w:b/>
+          <w:bCs/>
+          <w:color w:val="000000" w:themeColor="text1"/>
+        </w:rPr>
+        <w:t>:</w:t>
+      </w:r>
+      <w:r>
+        <w:rPr>
+          <w:rFonts w:ascii="Aptos" w:eastAsia="Aptos" w:hAnsi="Aptos" w:cs="Aptos"/>
+          <w:b/>
+          <w:bCs/>
+          <w:color w:val="000000" w:themeColor="text1"/>
+        </w:rPr>
+        <w:t xml:space="preserve"> z5425064</w:t>
       </w:r>
     </w:p>
     <w:p>
@@ -107,6 +136,15 @@
           <w:color w:val="000000" w:themeColor="text1"/>
         </w:rPr>
         <w:t>Date Submitted:</w:t>
+      </w:r>
+      <w:r>
+        <w:rPr>
+          <w:rFonts w:ascii="Aptos" w:eastAsia="Aptos" w:hAnsi="Aptos" w:cs="Aptos"/>
+          <w:b/>
+          <w:bCs/>
+          <w:color w:val="000000" w:themeColor="text1"/>
+        </w:rPr>
+        <w:t xml:space="preserve"> 14/06/2026</w:t>
       </w:r>
     </w:p>
     <w:p>
@@ -160,19 +198,126 @@
           <w:tcPr>
             <w:tcW w:w="9360" w:type="dxa"/>
           </w:tcPr>
-          <w:p/>
-          <w:p/>
-          <w:p/>
-          <w:p/>
-          <w:p/>
-          <w:p/>
-          <w:p/>
-          <w:p/>
-          <w:p/>
+          <w:p>
+            <w:r>
+              <w:t>While considering risks and secrets, I found an interesting news story about weaknesses in the Australian Parliament's network security. The article raises concerns that Parliament may not be managing these risks effectively, despite the potentially serious consequences of a breach. Phishing attacks continue to compromise the network, and a consultancy review has identified the need for major system upgrades.</w:t>
+            </w:r>
+          </w:p>
+          <w:p/>
+          <w:p>
+            <w:r>
+              <w:t>This issue can also be viewed through the lens of Type I and Type II errors. Parliament relies heavily on communication with external agencies, individuals, and foreign governments, so overly strict filtering could incorrectly block legitimate communications (false positives). However, maintaining a more open system increases the risk of malicious communications being accepted (false negatives), leaving the network vulnerable to phishing and other social engineering attacks.</w:t>
+            </w:r>
+          </w:p>
+          <w:p/>
+          <w:p>
+            <w:r>
+              <w:t xml:space="preserve">Overall, this demonstrates that security systems cannot simply be </w:t>
+            </w:r>
+            <w:proofErr w:type="spellStart"/>
+            <w:r>
+              <w:t>optimised</w:t>
+            </w:r>
+            <w:proofErr w:type="spellEnd"/>
+            <w:r>
+              <w:t xml:space="preserve"> for maximum restriction or maximum accessibility. Instead, they require careful risk assessment and a balance between security, usability, and operational requirements.</w:t>
+            </w:r>
+          </w:p>
+          <w:p>
+            <w:r>
+              <w:rPr>
+                <w:noProof/>
+              </w:rPr>
+              <w:drawing>
+                <wp:anchor distT="0" distB="0" distL="114300" distR="114300" simplePos="0" relativeHeight="251658240" behindDoc="0" locked="0" layoutInCell="1" allowOverlap="1" wp14:anchorId="6B28ED00" wp14:editId="42232192">
+                  <wp:simplePos x="0" y="0"/>
+                  <wp:positionH relativeFrom="column">
+                    <wp:posOffset>1187450</wp:posOffset>
+                  </wp:positionH>
+                  <wp:positionV relativeFrom="paragraph">
+                    <wp:posOffset>48601</wp:posOffset>
+                  </wp:positionV>
+                  <wp:extent cx="3123028" cy="2080830"/>
+                  <wp:effectExtent l="0" t="0" r="1270" b="0"/>
+                  <wp:wrapSquare wrapText="bothSides"/>
+                  <wp:docPr id="571868495" name="Picture 1" descr="More than 100,000 sensitive parliamentary emails and documents were handed to a private law firm despite internal warnings of an “extreme” cybersecurity risk."/>
+                  <wp:cNvGraphicFramePr>
+                    <a:graphicFrameLocks xmlns:a="http://schemas.openxmlformats.org/drawingml/2006/main" noChangeAspect="1"/>
+                  </wp:cNvGraphicFramePr>
+                  <a:graphic xmlns:a="http://schemas.openxmlformats.org/drawingml/2006/main">
+                    <a:graphicData uri="http://schemas.openxmlformats.org/drawingml/2006/picture">
+                      <pic:pic xmlns:pic="http://schemas.openxmlformats.org/drawingml/2006/picture">
+                        <pic:nvPicPr>
+                          <pic:cNvPr id="0" name="Picture 1" descr="More than 100,000 sensitive parliamentary emails and documents were handed to a private law firm despite internal warnings of an “extreme” cybersecurity risk."/>
+                          <pic:cNvPicPr>
+                            <a:picLocks noChangeAspect="1" noChangeArrowheads="1"/>
+                          </pic:cNvPicPr>
+                        </pic:nvPicPr>
+                        <pic:blipFill>
+                          <a:blip r:embed="rId8">
+                            <a:extLst>
+                              <a:ext uri="{28A0092B-C50C-407E-A947-70E740481C1C}">
+                                <a14:useLocalDpi xmlns:a14="http://schemas.microsoft.com/office/drawing/2010/main" val="0"/>
+                              </a:ext>
+                            </a:extLst>
+                          </a:blip>
+                          <a:srcRect/>
+                          <a:stretch>
+                            <a:fillRect/>
+                          </a:stretch>
+                        </pic:blipFill>
+                        <pic:spPr bwMode="auto">
+                          <a:xfrm>
+                            <a:off x="0" y="0"/>
+                            <a:ext cx="3123028" cy="2080830"/>
+                          </a:xfrm>
+                          <a:prstGeom prst="rect">
+                            <a:avLst/>
+                          </a:prstGeom>
+                          <a:noFill/>
+                          <a:ln>
+                            <a:noFill/>
+                          </a:ln>
+                        </pic:spPr>
+                      </pic:pic>
+                    </a:graphicData>
+                  </a:graphic>
+                </wp:anchor>
+              </w:drawing>
+            </w:r>
+          </w:p>
+          <w:p/>
+          <w:p>
+            <w:hyperlink r:id="rId9" w:history="1">
+              <w:r>
+                <w:rPr>
+                  <w:rStyle w:val="Hyperlink"/>
+                </w:rPr>
+                <w:t>https://www.smh.com.au/politics/federal/national-security-risk-</w:t>
+              </w:r>
+              <w:r>
+                <w:rPr>
+                  <w:rStyle w:val="Hyperlink"/>
+                </w:rPr>
+                <w:t>a</w:t>
+              </w:r>
+              <w:r>
+                <w:rPr>
+                  <w:rStyle w:val="Hyperlink"/>
+                </w:rPr>
+                <w:t>s-parliamentary-network-fails-seven-out-of-eight-basic-cyber-checks-20260611-p6061j.html</w:t>
+              </w:r>
+            </w:hyperlink>
+            <w:r>
+              <w:t xml:space="preserve"> </w:t>
+            </w:r>
+          </w:p>
           <w:p/>
         </w:tc>
       </w:tr>
     </w:tbl>
+    <w:p/>
+    <w:p/>
     <w:p/>
     <w:p>
       <w:pPr>
@@ -199,7 +344,7 @@
       <w:pPr>
         <w:pStyle w:val="Heading2"/>
       </w:pPr>
-      <w:hyperlink r:id="rId8">
+      <w:hyperlink r:id="rId10">
         <w:r>
           <w:rPr>
             <w:rStyle w:val="Hyperlink"/>
@@ -376,7 +521,6 @@
               <w:rPr>
                 <w:noProof/>
               </w:rPr>
-              <w:lastRenderedPageBreak/>
               <w:drawing>
                 <wp:inline distT="0" distB="0" distL="0" distR="0" wp14:anchorId="0022DA65" wp14:editId="4B0EDF7C">
                   <wp:extent cx="5676422" cy="3005593"/>
@@ -393,7 +537,7 @@
                           <pic:cNvPicPr/>
                         </pic:nvPicPr>
                         <pic:blipFill>
-                          <a:blip r:embed="rId9"/>
+                          <a:blip r:embed="rId11"/>
                           <a:stretch>
                             <a:fillRect/>
                           </a:stretch>
@@ -420,6 +564,7 @@
               <w:rPr>
                 <w:noProof/>
               </w:rPr>
+              <w:lastRenderedPageBreak/>
               <w:drawing>
                 <wp:inline distT="0" distB="0" distL="0" distR="0" wp14:anchorId="09B5EE59" wp14:editId="23858295">
                   <wp:extent cx="5943600" cy="1883410"/>
@@ -436,7 +581,7 @@
                           <pic:cNvPicPr/>
                         </pic:nvPicPr>
                         <pic:blipFill>
-                          <a:blip r:embed="rId10"/>
+                          <a:blip r:embed="rId12"/>
                           <a:stretch>
                             <a:fillRect/>
                           </a:stretch>
@@ -484,7 +629,7 @@
         <w:pStyle w:val="Heading2"/>
         <w:spacing w:before="0" w:after="160"/>
       </w:pPr>
-      <w:hyperlink r:id="rId11">
+      <w:hyperlink r:id="rId13">
         <w:r>
           <w:rPr>
             <w:rStyle w:val="Hyperlink"/>
@@ -527,11 +672,7 @@
           </w:p>
           <w:p>
             <w:r>
-              <w:t xml:space="preserve">The most interesting part of the Playfair Cipher was how much it relies on the secrecy of the key grid. Once an attacker can make good guesses about parts of the message, the </w:t>
-            </w:r>
-            <w:r>
-              <w:lastRenderedPageBreak/>
-              <w:t>grid becomes much easier to reconstruct, which weakens the whole system. This shows how a single point of failure can make an encryption method vulnerable.</w:t>
+              <w:t>The most interesting part of the Playfair Cipher was how much it relies on the secrecy of the key grid. Once an attacker can make good guesses about parts of the message, the grid becomes much easier to reconstruct, which weakens the whole system. This shows how a single point of failure can make an encryption method vulnerable.</w:t>
             </w:r>
           </w:p>
           <w:p/>
@@ -542,6 +683,10 @@
           </w:p>
           <w:p>
             <w:r>
+              <w:rPr>
+                <w:noProof/>
+              </w:rPr>
+              <w:lastRenderedPageBreak/>
               <w:drawing>
                 <wp:inline distT="0" distB="0" distL="0" distR="0" wp14:anchorId="6DE2F0A1" wp14:editId="36363199">
                   <wp:extent cx="5943600" cy="4239895"/>
@@ -558,7 +703,7 @@
                           <pic:cNvPicPr/>
                         </pic:nvPicPr>
                         <pic:blipFill>
-                          <a:blip r:embed="rId12"/>
+                          <a:blip r:embed="rId14"/>
                           <a:stretch>
                             <a:fillRect/>
                           </a:stretch>
@@ -617,7 +762,7 @@
       <w:pPr>
         <w:pStyle w:val="Heading2"/>
       </w:pPr>
-      <w:hyperlink r:id="rId13">
+      <w:hyperlink r:id="rId15">
         <w:r>
           <w:rPr>
             <w:rStyle w:val="Hyperlink"/>
@@ -650,9 +795,6 @@
           <w:p/>
           <w:p/>
           <w:p/>
-          <w:p/>
-          <w:p/>
-          <w:p/>
         </w:tc>
       </w:tr>
     </w:tbl>
@@ -686,7 +828,7 @@
       <w:pPr>
         <w:pStyle w:val="Heading2"/>
       </w:pPr>
-      <w:hyperlink r:id="rId14">
+      <w:hyperlink r:id="rId16">
         <w:r>
           <w:rPr>
             <w:rStyle w:val="Hyperlink"/>
@@ -759,7 +901,7 @@
       <w:pPr>
         <w:pStyle w:val="Heading2"/>
       </w:pPr>
-      <w:hyperlink r:id="rId15">
+      <w:hyperlink r:id="rId17">
         <w:r>
           <w:rPr>
             <w:rStyle w:val="Hyperlink"/>
@@ -849,11 +991,15 @@
               </w:numPr>
             </w:pPr>
             <w:r>
-              <w:t xml:space="preserve">One question was whether the protected assets should also include people or organisations that are not directly connected to the plane, such as people on </w:t>
-            </w:r>
-            <w:r>
-              <w:lastRenderedPageBreak/>
-              <w:t>the ground or the reputation of aviation authorities. I think they should be included, because even if the airline does not own these assets, it still has a duty to protect them if harm could be caused by something under its control and hence could also been seen as negligence from a legal aspect i</w:t>
+              <w:t xml:space="preserve">One question was whether the protected assets should also include people or </w:t>
+            </w:r>
+            <w:proofErr w:type="spellStart"/>
+            <w:r>
+              <w:t>organisations</w:t>
+            </w:r>
+            <w:proofErr w:type="spellEnd"/>
+            <w:r>
+              <w:t xml:space="preserve"> that are not directly connected to the plane, such as people on the ground or the reputation of aviation authorities. I think they should be included, because even if the airline does not own these assets, it still has a duty to protect them if harm could be caused by something under its control and hence could also been seen as negligence from a legal aspect i</w:t>
             </w:r>
             <w:r>
               <w:t>f</w:t>
@@ -923,7 +1069,16 @@
               </w:numPr>
             </w:pPr>
             <w:r>
-              <w:t>Another suggestion was to let remote systems take over from a malicious pilot, recover the plane’s position, and protect everyone on board. Most people argued that this would create a new vulnerability by giving external attackers another possible way to access the aircraft. My view was slightly different. Autopilot systems already rely heavily on external data from GPS, radar, and gyroscopes to control the plane. If an attacker can feed false information into these sensors, they may be able to mislead the autopilot and indirectly influence the aircraft without needing full authorised access. This is similar to some CUAS attacks, where external signals are used to manipulate a system. In that sense, the current setup already has a type 1 weakness while trying to prevent a type 2 failure</w:t>
+              <w:lastRenderedPageBreak/>
+              <w:t xml:space="preserve">Another suggestion was to let remote systems take over from a malicious pilot, recover the plane’s position, and protect everyone on board. Most people argued that this would create a new vulnerability by giving external attackers another possible way to access the aircraft. My view was slightly different. Autopilot systems already rely heavily on external data from GPS, radar, and gyroscopes to control the plane. If an attacker can feed false information into these sensors, they may be able to mislead the autopilot and indirectly influence the aircraft without needing full </w:t>
+            </w:r>
+            <w:proofErr w:type="spellStart"/>
+            <w:r>
+              <w:t>authorised</w:t>
+            </w:r>
+            <w:proofErr w:type="spellEnd"/>
+            <w:r>
+              <w:t xml:space="preserve"> access. This is similar to some CUAS attacks, where external signals are used to manipulate a system. In that sense, the current setup already has a type 1 weakness while trying to prevent a type 2 failure</w:t>
             </w:r>
             <w:r>
               <w:t>, hence should be rebalanced by providing remote access.</w:t>
@@ -939,7 +1094,15 @@
               <w:spacing w:after="160" w:line="279" w:lineRule="auto"/>
             </w:pPr>
             <w:r>
-              <w:t>Another proposal was to require two approvals before the cockpit door could be unlocked: one from a staff member and one from another person with a key. I mostly agreed with this because it adds a second judgement instead of relying on one person alone. To reduce the risk of coercion or pre-planning, I suggested that the second person should be randomly selected from authorised key holders on the plane. This would make it harder for attackers to predict or control who is involved. However, it could also increase the type 2 risk if a group of attackers stole keys and used them to force access to the cockpit.</w:t>
+              <w:t xml:space="preserve">Another proposal was to require two approvals before the cockpit door could be unlocked: one from a staff member and one from another person with a key. I mostly agreed with this because it adds a second judgement instead of relying on one person alone. To reduce the risk of coercion or pre-planning, I suggested that the second person should be randomly selected from </w:t>
+            </w:r>
+            <w:proofErr w:type="spellStart"/>
+            <w:r>
+              <w:t>authorised</w:t>
+            </w:r>
+            <w:proofErr w:type="spellEnd"/>
+            <w:r>
+              <w:t xml:space="preserve"> key holders on the plane. This would make it harder for attackers to predict or control who is involved. However, it could also increase the type 2 risk if a group of attackers stole keys and used them to force access to the cockpit.</w:t>
             </w:r>
           </w:p>
           <w:p/>
@@ -964,7 +1127,6 @@
           <w:b/>
           <w:bCs/>
         </w:rPr>
-        <w:lastRenderedPageBreak/>
         <w:t xml:space="preserve">5. </w:t>
       </w:r>
       <w:r>
@@ -989,8 +1151,8 @@
       </w:r>
     </w:p>
     <w:sectPr>
-      <w:headerReference w:type="default" r:id="rId16"/>
-      <w:footerReference w:type="default" r:id="rId17"/>
+      <w:headerReference w:type="default" r:id="rId18"/>
+      <w:footerReference w:type="default" r:id="rId19"/>
       <w:pgSz w:w="12240" w:h="15840"/>
       <w:pgMar w:top="1440" w:right="1440" w:bottom="1440" w:left="1440" w:header="720" w:footer="720" w:gutter="0"/>
       <w:cols w:space="720"/>
@@ -3333,7 +3495,6 @@
   <w:style w:type="character" w:default="1" w:styleId="DefaultParagraphFont">
     <w:name w:val="Default Paragraph Font"/>
     <w:uiPriority w:val="1"/>
-    <w:semiHidden/>
     <w:unhideWhenUsed/>
   </w:style>
   <w:style w:type="table" w:default="1" w:styleId="TableNormal">
@@ -3470,6 +3631,18 @@
       <w:szCs w:val="27"/>
       <w:lang w:val="en-AU" w:eastAsia="en-AU"/>
       <w14:ligatures w14:val="standardContextual"/>
+    </w:rPr>
+  </w:style>
+  <w:style w:type="character" w:styleId="UnresolvedMention">
+    <w:name w:val="Unresolved Mention"/>
+    <w:basedOn w:val="DefaultParagraphFont"/>
+    <w:uiPriority w:val="99"/>
+    <w:semiHidden/>
+    <w:unhideWhenUsed/>
+    <w:rsid w:val="00DB23B1"/>
+    <w:rPr>
+      <w:color w:val="605E5C"/>
+      <w:shd w:val="clear" w:color="auto" w:fill="E1DFDD"/>
     </w:rPr>
   </w:style>
 </w:styles>

</xml_diff>